<commit_message>
Modificación de esquema base de datos: nuevas tablas para manejar efectivo
</commit_message>
<xml_diff>
--- a/docs/dictionary/data-dictionary.docx
+++ b/docs/dictionary/data-dictionary.docx
@@ -84,7 +84,7 @@
           <w:szCs w:val="20"/>
           <w:rtl w:val="0"/>
         </w:rPr>
-        <w:t xml:space="preserve">Versión de esquema: 1</w:t>
+        <w:t>Versión de esquema: 2</w:t>
       </w:r>
       <w:r>
         <w:rPr>
@@ -507,7 +507,7 @@
         <w:rPr>
           <w:rtl w:val="0"/>
         </w:rPr>
-        <w:t xml:space="preserve">El diagrama siguiente muestra las 11 tablas del esquema y sus relaciones. El color indica el tipo de tabla: azul claro para catálogos/entidades base, naranja para el ciclo de venta, verde para bitácoras de auditoría y gris para configuración/diagnóstico.</w:t>
+        <w:t>El diagrama siguiente muestra las 14 tablas del esquema y sus relaciones. El color indica el tipo de tabla: azul claro para catálogos/entidades base, naranja para el ciclo de venta, verde para bitácoras de auditoría y gris para configuración/diagnóstico.</w:t>
       </w:r>
     </w:p>
     <w:p>
@@ -13315,6 +13315,2355 @@
     </w:tbl>
     <w:p>
       <w:pPr>
+        <w:pStyle w:val="Heading2"/>
+        <w:spacing w:after="150" w:before="300" w:lineRule="auto"/>
+        <w:rPr/>
+      </w:pPr>
+      <w:r>
+        <w:t>4.12 denominaciones</w:t>
+      </w:r>
+    </w:p>
+    <w:p>
+      <w:pPr>
+        <w:spacing w:after="120" w:lineRule="auto"/>
+        <w:rPr/>
+      </w:pPr>
+      <w:r>
+        <w:t>Catálogo de los valores de efectivo (monedas y billetes) que el teclado permite seleccionar para simular un pago en efectivo. No representa un validador físico de billetes o monedas: la máquina no acepta efectivo real, según lo definido por Arquitectura.</w:t>
+      </w:r>
+    </w:p>
+    <w:tbl>
+      <w:tblPr>
+        <w:tblStyle w:val="Table11"/>
+        <w:tblW w:w="10240.0" w:type="dxa"/>
+        <w:jc w:val="left"/>
+        <w:tblBorders>
+          <w:top w:color="000000" w:space="0" w:sz="4" w:val="single"/>
+          <w:left w:color="000000" w:space="0" w:sz="4" w:val="single"/>
+          <w:bottom w:color="000000" w:space="0" w:sz="4" w:val="single"/>
+          <w:right w:color="000000" w:space="0" w:sz="4" w:val="single"/>
+          <w:insideH w:color="000000" w:space="0" w:sz="4" w:val="single"/>
+          <w:insideV w:color="000000" w:space="0" w:sz="4" w:val="single"/>
+        </w:tblBorders>
+        <w:tblLayout w:type="fixed"/>
+        <w:tblLook w:val="0000"/>
+      </w:tblPr>
+      <w:tblGrid>
+        <w:gridCol w:w="1700"/>
+        <w:gridCol w:w="1500"/>
+        <w:gridCol w:w="1700"/>
+        <w:gridCol w:w="5340"/>
+        <w:tblGridChange w:id="0">
+          <w:tblGrid>
+            <w:gridCol w:w="1700"/>
+            <w:gridCol w:w="1500"/>
+            <w:gridCol w:w="1700"/>
+            <w:gridCol w:w="5340"/>
+          </w:tblGrid>
+        </w:tblGridChange>
+      </w:tblGrid>
+      <w:tr>
+        <w:trPr>
+          <w:cantSplit w:val="0"/>
+          <w:tblHeader w:val="1"/>
+        </w:trPr>
+        <w:tc>
+          <w:tcPr>
+            <w:shd w:fill="1f3864" w:val="clear"/>
+            <w:tcMar>
+              <w:top w:w="80.0" w:type="dxa"/>
+              <w:left w:w="100.0" w:type="dxa"/>
+              <w:bottom w:w="80.0" w:type="dxa"/>
+              <w:right w:w="100.0" w:type="dxa"/>
+            </w:tcMar>
+            <w:vAlign w:val="center"/>
+          </w:tcPr>
+          <w:p>
+            <w:pPr>
+              <w:rPr/>
+            </w:pPr>
+            <w:r>
+              <w:rPr>
+                <w:rFonts w:ascii="Consolas" w:cs="Consolas" w:eastAsia="Consolas" w:hAnsi="Consolas"/>
+                <w:b w:val="1"/>
+                <w:bCs w:val="1"/>
+                <w:color w:val="ffffff"/>
+                <w:sz w:val="20"/>
+                <w:szCs w:val="20"/>
+                <w:rtl w:val="0"/>
+              </w:rPr>
+              <w:t xml:space="preserve">Atributo</w:t>
+            </w:r>
+            <w:r>
+              <w:rPr>
+                <w:rtl w:val="0"/>
+              </w:rPr>
+            </w:r>
+          </w:p>
+        </w:tc>
+        <w:tc>
+          <w:tcPr>
+            <w:shd w:fill="1f3864" w:val="clear"/>
+            <w:tcMar>
+              <w:top w:w="80.0" w:type="dxa"/>
+              <w:left w:w="100.0" w:type="dxa"/>
+              <w:bottom w:w="80.0" w:type="dxa"/>
+              <w:right w:w="100.0" w:type="dxa"/>
+            </w:tcMar>
+            <w:vAlign w:val="center"/>
+          </w:tcPr>
+          <w:p>
+            <w:pPr>
+              <w:rPr/>
+            </w:pPr>
+            <w:r>
+              <w:rPr>
+                <w:rFonts w:ascii="Consolas" w:cs="Consolas" w:eastAsia="Consolas" w:hAnsi="Consolas"/>
+                <w:b w:val="1"/>
+                <w:bCs w:val="1"/>
+                <w:color w:val="ffffff"/>
+                <w:sz w:val="20"/>
+                <w:szCs w:val="20"/>
+                <w:rtl w:val="0"/>
+              </w:rPr>
+              <w:t xml:space="preserve">Tipo SQLite</w:t>
+            </w:r>
+            <w:r>
+              <w:rPr>
+                <w:rtl w:val="0"/>
+              </w:rPr>
+            </w:r>
+          </w:p>
+        </w:tc>
+        <w:tc>
+          <w:tcPr>
+            <w:shd w:fill="1f3864" w:val="clear"/>
+            <w:tcMar>
+              <w:top w:w="80.0" w:type="dxa"/>
+              <w:left w:w="100.0" w:type="dxa"/>
+              <w:bottom w:w="80.0" w:type="dxa"/>
+              <w:right w:w="100.0" w:type="dxa"/>
+            </w:tcMar>
+            <w:vAlign w:val="center"/>
+          </w:tcPr>
+          <w:p>
+            <w:pPr>
+              <w:rPr/>
+            </w:pPr>
+            <w:r>
+              <w:rPr>
+                <w:rFonts w:ascii="Consolas" w:cs="Consolas" w:eastAsia="Consolas" w:hAnsi="Consolas"/>
+                <w:b w:val="1"/>
+                <w:bCs w:val="1"/>
+                <w:color w:val="ffffff"/>
+                <w:sz w:val="20"/>
+                <w:szCs w:val="20"/>
+                <w:rtl w:val="0"/>
+              </w:rPr>
+              <w:t xml:space="preserve">Llave / Restricción</w:t>
+            </w:r>
+            <w:r>
+              <w:rPr>
+                <w:rtl w:val="0"/>
+              </w:rPr>
+            </w:r>
+          </w:p>
+        </w:tc>
+        <w:tc>
+          <w:tcPr>
+            <w:shd w:fill="1f3864" w:val="clear"/>
+            <w:tcMar>
+              <w:top w:w="80.0" w:type="dxa"/>
+              <w:left w:w="100.0" w:type="dxa"/>
+              <w:bottom w:w="80.0" w:type="dxa"/>
+              <w:right w:w="100.0" w:type="dxa"/>
+            </w:tcMar>
+            <w:vAlign w:val="center"/>
+          </w:tcPr>
+          <w:p>
+            <w:pPr>
+              <w:rPr/>
+            </w:pPr>
+            <w:r>
+              <w:rPr>
+                <w:rFonts w:ascii="Consolas" w:cs="Consolas" w:eastAsia="Consolas" w:hAnsi="Consolas"/>
+                <w:b w:val="1"/>
+                <w:bCs w:val="1"/>
+                <w:color w:val="ffffff"/>
+                <w:sz w:val="20"/>
+                <w:szCs w:val="20"/>
+                <w:rtl w:val="0"/>
+              </w:rPr>
+              <w:t xml:space="preserve">Descripción</w:t>
+            </w:r>
+            <w:r>
+              <w:rPr>
+                <w:rtl w:val="0"/>
+              </w:rPr>
+            </w:r>
+          </w:p>
+        </w:tc>
+      </w:tr>
+      <w:tr>
+        <w:trPr>
+          <w:cantSplit w:val="0"/>
+          <w:tblHeader w:val="0"/>
+        </w:trPr>
+        <w:tc>
+          <w:tcPr>
+            <w:shd w:fill="ffffff" w:val="clear"/>
+            <w:tcMar>
+              <w:top w:w="80.0" w:type="dxa"/>
+              <w:left w:w="100.0" w:type="dxa"/>
+              <w:bottom w:w="80.0" w:type="dxa"/>
+              <w:right w:w="100.0" w:type="dxa"/>
+            </w:tcMar>
+            <w:vAlign w:val="center"/>
+          </w:tcPr>
+          <w:p>
+            <w:pPr>
+              <w:rPr/>
+            </w:pPr>
+            <w:r>
+              <w:rPr>
+                <w:rFonts w:ascii="Consolas" w:hAnsi="Consolas" w:cs="Consolas"/>
+                <w:b/>
+                <w:sz w:val="19"/>
+              </w:rPr>
+              <w:t>id_denominacion</w:t>
+            </w:r>
+          </w:p>
+        </w:tc>
+        <w:tc>
+          <w:tcPr>
+            <w:shd w:fill="ffffff" w:val="clear"/>
+            <w:tcMar>
+              <w:top w:w="80.0" w:type="dxa"/>
+              <w:left w:w="100.0" w:type="dxa"/>
+              <w:bottom w:w="80.0" w:type="dxa"/>
+              <w:right w:w="100.0" w:type="dxa"/>
+            </w:tcMar>
+            <w:vAlign w:val="center"/>
+          </w:tcPr>
+          <w:p>
+            <w:pPr>
+              <w:rPr/>
+            </w:pPr>
+            <w:r>
+              <w:rPr>
+                <w:rFonts w:ascii="Consolas" w:hAnsi="Consolas" w:cs="Consolas"/>
+                <w:b w:val="0"/>
+                <w:sz w:val="19"/>
+              </w:rPr>
+              <w:t>INTEGER</w:t>
+            </w:r>
+          </w:p>
+        </w:tc>
+        <w:tc>
+          <w:tcPr>
+            <w:shd w:fill="ffffff" w:val="clear"/>
+            <w:tcMar>
+              <w:top w:w="80.0" w:type="dxa"/>
+              <w:left w:w="100.0" w:type="dxa"/>
+              <w:bottom w:w="80.0" w:type="dxa"/>
+              <w:right w:w="100.0" w:type="dxa"/>
+            </w:tcMar>
+            <w:vAlign w:val="center"/>
+          </w:tcPr>
+          <w:p>
+            <w:pPr>
+              <w:rPr/>
+            </w:pPr>
+            <w:r>
+              <w:rPr>
+                <w:rFonts w:ascii="Consolas" w:hAnsi="Consolas" w:cs="Consolas"/>
+                <w:b w:val="0"/>
+                <w:sz w:val="19"/>
+              </w:rPr>
+              <w:t>PK, AUTOINCREMENT</w:t>
+            </w:r>
+          </w:p>
+        </w:tc>
+        <w:tc>
+          <w:tcPr>
+            <w:shd w:fill="ffffff" w:val="clear"/>
+            <w:tcMar>
+              <w:top w:w="80.0" w:type="dxa"/>
+              <w:left w:w="100.0" w:type="dxa"/>
+              <w:bottom w:w="80.0" w:type="dxa"/>
+              <w:right w:w="100.0" w:type="dxa"/>
+            </w:tcMar>
+            <w:vAlign w:val="center"/>
+          </w:tcPr>
+          <w:p>
+            <w:pPr>
+              <w:rPr/>
+            </w:pPr>
+            <w:r>
+              <w:rPr>
+                <w:b w:val="0"/>
+                <w:sz w:val="19"/>
+              </w:rPr>
+              <w:t>Identificador interno de la denominación.</w:t>
+            </w:r>
+          </w:p>
+        </w:tc>
+      </w:tr>
+      <w:tr>
+        <w:trPr>
+          <w:cantSplit w:val="0"/>
+          <w:tblHeader w:val="0"/>
+        </w:trPr>
+        <w:tc>
+          <w:tcPr>
+            <w:shd w:fill="f2f2f2" w:val="clear"/>
+            <w:tcMar>
+              <w:top w:w="80.0" w:type="dxa"/>
+              <w:left w:w="100.0" w:type="dxa"/>
+              <w:bottom w:w="80.0" w:type="dxa"/>
+              <w:right w:w="100.0" w:type="dxa"/>
+            </w:tcMar>
+            <w:vAlign w:val="center"/>
+          </w:tcPr>
+          <w:p>
+            <w:pPr>
+              <w:rPr/>
+            </w:pPr>
+            <w:r>
+              <w:rPr>
+                <w:rFonts w:ascii="Consolas" w:hAnsi="Consolas" w:cs="Consolas"/>
+                <w:b/>
+                <w:sz w:val="19"/>
+              </w:rPr>
+              <w:t>valor_centavos</w:t>
+            </w:r>
+          </w:p>
+        </w:tc>
+        <w:tc>
+          <w:tcPr>
+            <w:shd w:fill="f2f2f2" w:val="clear"/>
+            <w:tcMar>
+              <w:top w:w="80.0" w:type="dxa"/>
+              <w:left w:w="100.0" w:type="dxa"/>
+              <w:bottom w:w="80.0" w:type="dxa"/>
+              <w:right w:w="100.0" w:type="dxa"/>
+            </w:tcMar>
+            <w:vAlign w:val="center"/>
+          </w:tcPr>
+          <w:p>
+            <w:pPr>
+              <w:rPr/>
+            </w:pPr>
+            <w:r>
+              <w:rPr>
+                <w:rFonts w:ascii="Consolas" w:hAnsi="Consolas" w:cs="Consolas"/>
+                <w:b w:val="0"/>
+                <w:sz w:val="19"/>
+              </w:rPr>
+              <w:t>INTEGER</w:t>
+            </w:r>
+          </w:p>
+        </w:tc>
+        <w:tc>
+          <w:tcPr>
+            <w:shd w:fill="f2f2f2" w:val="clear"/>
+            <w:tcMar>
+              <w:top w:w="80.0" w:type="dxa"/>
+              <w:left w:w="100.0" w:type="dxa"/>
+              <w:bottom w:w="80.0" w:type="dxa"/>
+              <w:right w:w="100.0" w:type="dxa"/>
+            </w:tcMar>
+            <w:vAlign w:val="center"/>
+          </w:tcPr>
+          <w:p>
+            <w:pPr>
+              <w:rPr/>
+            </w:pPr>
+            <w:r>
+              <w:rPr>
+                <w:rFonts w:ascii="Consolas" w:hAnsi="Consolas" w:cs="Consolas"/>
+                <w:b w:val="0"/>
+                <w:sz w:val="19"/>
+              </w:rPr>
+              <w:t>NOT NULL, CHECK &gt; 0</w:t>
+            </w:r>
+          </w:p>
+        </w:tc>
+        <w:tc>
+          <w:tcPr>
+            <w:shd w:fill="f2f2f2" w:val="clear"/>
+            <w:tcMar>
+              <w:top w:w="80.0" w:type="dxa"/>
+              <w:left w:w="100.0" w:type="dxa"/>
+              <w:bottom w:w="80.0" w:type="dxa"/>
+              <w:right w:w="100.0" w:type="dxa"/>
+            </w:tcMar>
+            <w:vAlign w:val="center"/>
+          </w:tcPr>
+          <w:p>
+            <w:pPr>
+              <w:rPr/>
+            </w:pPr>
+            <w:r>
+              <w:rPr>
+                <w:b w:val="0"/>
+                <w:sz w:val="19"/>
+              </w:rPr>
+              <w:t>Valor nominal de la denominación, en centavos.</w:t>
+            </w:r>
+          </w:p>
+        </w:tc>
+      </w:tr>
+      <w:tr>
+        <w:trPr>
+          <w:cantSplit w:val="0"/>
+          <w:tblHeader w:val="0"/>
+        </w:trPr>
+        <w:tc>
+          <w:tcPr>
+            <w:shd w:fill="ffffff" w:val="clear"/>
+            <w:tcMar>
+              <w:top w:w="80.0" w:type="dxa"/>
+              <w:left w:w="100.0" w:type="dxa"/>
+              <w:bottom w:w="80.0" w:type="dxa"/>
+              <w:right w:w="100.0" w:type="dxa"/>
+            </w:tcMar>
+            <w:vAlign w:val="center"/>
+          </w:tcPr>
+          <w:p>
+            <w:pPr>
+              <w:rPr/>
+            </w:pPr>
+            <w:r>
+              <w:rPr>
+                <w:rFonts w:ascii="Consolas" w:hAnsi="Consolas" w:cs="Consolas"/>
+                <w:b/>
+                <w:sz w:val="19"/>
+              </w:rPr>
+              <w:t>tipo</w:t>
+            </w:r>
+          </w:p>
+        </w:tc>
+        <w:tc>
+          <w:tcPr>
+            <w:shd w:fill="ffffff" w:val="clear"/>
+            <w:tcMar>
+              <w:top w:w="80.0" w:type="dxa"/>
+              <w:left w:w="100.0" w:type="dxa"/>
+              <w:bottom w:w="80.0" w:type="dxa"/>
+              <w:right w:w="100.0" w:type="dxa"/>
+            </w:tcMar>
+            <w:vAlign w:val="center"/>
+          </w:tcPr>
+          <w:p>
+            <w:pPr>
+              <w:rPr/>
+            </w:pPr>
+            <w:r>
+              <w:rPr>
+                <w:rFonts w:ascii="Consolas" w:hAnsi="Consolas" w:cs="Consolas"/>
+                <w:b w:val="0"/>
+                <w:sz w:val="19"/>
+              </w:rPr>
+              <w:t>TEXT</w:t>
+            </w:r>
+          </w:p>
+        </w:tc>
+        <w:tc>
+          <w:tcPr>
+            <w:shd w:fill="ffffff" w:val="clear"/>
+            <w:tcMar>
+              <w:top w:w="80.0" w:type="dxa"/>
+              <w:left w:w="100.0" w:type="dxa"/>
+              <w:bottom w:w="80.0" w:type="dxa"/>
+              <w:right w:w="100.0" w:type="dxa"/>
+            </w:tcMar>
+            <w:vAlign w:val="center"/>
+          </w:tcPr>
+          <w:p>
+            <w:pPr>
+              <w:rPr/>
+            </w:pPr>
+            <w:r>
+              <w:rPr>
+                <w:rFonts w:ascii="Consolas" w:hAnsi="Consolas" w:cs="Consolas"/>
+                <w:b w:val="0"/>
+                <w:sz w:val="19"/>
+              </w:rPr>
+              <w:t>NOT NULL, CHECK IN ('moneda','billete')</w:t>
+            </w:r>
+          </w:p>
+        </w:tc>
+        <w:tc>
+          <w:tcPr>
+            <w:shd w:fill="ffffff" w:val="clear"/>
+            <w:tcMar>
+              <w:top w:w="80.0" w:type="dxa"/>
+              <w:left w:w="100.0" w:type="dxa"/>
+              <w:bottom w:w="80.0" w:type="dxa"/>
+              <w:right w:w="100.0" w:type="dxa"/>
+            </w:tcMar>
+            <w:vAlign w:val="center"/>
+          </w:tcPr>
+          <w:p>
+            <w:pPr>
+              <w:rPr/>
+            </w:pPr>
+            <w:r>
+              <w:rPr>
+                <w:b w:val="0"/>
+                <w:sz w:val="19"/>
+              </w:rPr>
+              <w:t>Distingue monedas de billetes; necesario porque el valor $20 existe en ambas formas en pesos mexicanos.</w:t>
+            </w:r>
+          </w:p>
+        </w:tc>
+      </w:tr>
+      <w:tr>
+        <w:trPr>
+          <w:cantSplit w:val="0"/>
+          <w:tblHeader w:val="0"/>
+        </w:trPr>
+        <w:tc>
+          <w:tcPr>
+            <w:shd w:fill="f2f2f2" w:val="clear"/>
+            <w:tcMar>
+              <w:top w:w="80.0" w:type="dxa"/>
+              <w:left w:w="100.0" w:type="dxa"/>
+              <w:bottom w:w="80.0" w:type="dxa"/>
+              <w:right w:w="100.0" w:type="dxa"/>
+            </w:tcMar>
+            <w:vAlign w:val="center"/>
+          </w:tcPr>
+          <w:p>
+            <w:pPr>
+              <w:rPr/>
+            </w:pPr>
+            <w:r>
+              <w:rPr>
+                <w:rFonts w:ascii="Consolas" w:hAnsi="Consolas" w:cs="Consolas"/>
+                <w:b/>
+                <w:sz w:val="19"/>
+              </w:rPr>
+              <w:t>activa</w:t>
+            </w:r>
+          </w:p>
+        </w:tc>
+        <w:tc>
+          <w:tcPr>
+            <w:shd w:fill="f2f2f2" w:val="clear"/>
+            <w:tcMar>
+              <w:top w:w="80.0" w:type="dxa"/>
+              <w:left w:w="100.0" w:type="dxa"/>
+              <w:bottom w:w="80.0" w:type="dxa"/>
+              <w:right w:w="100.0" w:type="dxa"/>
+            </w:tcMar>
+            <w:vAlign w:val="center"/>
+          </w:tcPr>
+          <w:p>
+            <w:pPr>
+              <w:rPr/>
+            </w:pPr>
+            <w:r>
+              <w:rPr>
+                <w:rFonts w:ascii="Consolas" w:hAnsi="Consolas" w:cs="Consolas"/>
+                <w:b w:val="0"/>
+                <w:sz w:val="19"/>
+              </w:rPr>
+              <w:t>INTEGER</w:t>
+            </w:r>
+          </w:p>
+        </w:tc>
+        <w:tc>
+          <w:tcPr>
+            <w:shd w:fill="f2f2f2" w:val="clear"/>
+            <w:tcMar>
+              <w:top w:w="80.0" w:type="dxa"/>
+              <w:left w:w="100.0" w:type="dxa"/>
+              <w:bottom w:w="80.0" w:type="dxa"/>
+              <w:right w:w="100.0" w:type="dxa"/>
+            </w:tcMar>
+            <w:vAlign w:val="center"/>
+          </w:tcPr>
+          <w:p>
+            <w:pPr>
+              <w:rPr/>
+            </w:pPr>
+            <w:r>
+              <w:rPr>
+                <w:rFonts w:ascii="Consolas" w:hAnsi="Consolas" w:cs="Consolas"/>
+                <w:b w:val="0"/>
+                <w:sz w:val="19"/>
+              </w:rPr>
+              <w:t>NOT NULL, CHECK IN (0,1)</w:t>
+            </w:r>
+          </w:p>
+        </w:tc>
+        <w:tc>
+          <w:tcPr>
+            <w:shd w:fill="f2f2f2" w:val="clear"/>
+            <w:tcMar>
+              <w:top w:w="80.0" w:type="dxa"/>
+              <w:left w:w="100.0" w:type="dxa"/>
+              <w:bottom w:w="80.0" w:type="dxa"/>
+              <w:right w:w="100.0" w:type="dxa"/>
+            </w:tcMar>
+            <w:vAlign w:val="center"/>
+          </w:tcPr>
+          <w:p>
+            <w:pPr>
+              <w:rPr/>
+            </w:pPr>
+            <w:r>
+              <w:rPr>
+                <w:b w:val="0"/>
+                <w:sz w:val="19"/>
+              </w:rPr>
+              <w:t>Baja lógica de la denominación.</w:t>
+            </w:r>
+          </w:p>
+        </w:tc>
+      </w:tr>
+    </w:tbl>
+    <w:p>
+      <w:pPr>
+        <w:spacing w:after="60" w:before="100" w:lineRule="auto"/>
+        <w:rPr/>
+      </w:pPr>
+      <w:r>
+        <w:rPr>
+          <w:b w:val="1"/>
+          <w:bCs w:val="1"/>
+          <w:i w:val="1"/>
+          <w:iCs w:val="1"/>
+          <w:rtl w:val="0"/>
+        </w:rPr>
+        <w:t xml:space="preserve">Notas de diseño:</w:t>
+      </w:r>
+      <w:r>
+        <w:rPr>
+          <w:rtl w:val="0"/>
+        </w:rPr>
+      </w:r>
+    </w:p>
+    <w:p>
+      <w:pPr>
+        <w:keepNext w:val="0"/>
+        <w:keepLines w:val="0"/>
+        <w:pageBreakBefore w:val="0"/>
+        <w:widowControl w:val="1"/>
+        <w:numPr>
+          <w:ilvl w:val="0"/>
+          <w:numId w:val="1"/>
+        </w:numPr>
+        <w:pBdr>
+          <w:top w:space="0" w:sz="0" w:val="nil"/>
+          <w:left w:space="0" w:sz="0" w:val="nil"/>
+          <w:bottom w:space="0" w:sz="0" w:val="nil"/>
+          <w:right w:space="0" w:sz="0" w:val="nil"/>
+          <w:between w:space="0" w:sz="0" w:val="nil"/>
+        </w:pBdr>
+        <w:shd w:fill="auto" w:val="clear"/>
+        <w:spacing w:after="60" w:before="0" w:line="240" w:lineRule="auto"/>
+        <w:ind w:left="360" w:right="0" w:hanging="260"/>
+        <w:jc w:val="left"/>
+        <w:rPr/>
+      </w:pPr>
+      <w:r>
+        <w:t>La combinación (valor_centavos, tipo) es UNIQUE, no solo valor_centavos, porque el peso mexicano tiene denominaciones de $20 tanto en moneda como en billete.</w:t>
+      </w:r>
+    </w:p>
+    <w:p>
+      <w:pPr>
+        <w:keepNext w:val="0"/>
+        <w:keepLines w:val="0"/>
+        <w:pageBreakBefore w:val="0"/>
+        <w:widowControl w:val="1"/>
+        <w:numPr>
+          <w:ilvl w:val="0"/>
+          <w:numId w:val="1"/>
+        </w:numPr>
+        <w:pBdr>
+          <w:top w:space="0" w:sz="0" w:val="nil"/>
+          <w:left w:space="0" w:sz="0" w:val="nil"/>
+          <w:bottom w:space="0" w:sz="0" w:val="nil"/>
+          <w:right w:space="0" w:sz="0" w:val="nil"/>
+          <w:between w:space="0" w:sz="0" w:val="nil"/>
+        </w:pBdr>
+        <w:shd w:fill="auto" w:val="clear"/>
+        <w:spacing w:after="60" w:before="0" w:line="240" w:lineRule="auto"/>
+        <w:ind w:left="360" w:right="0" w:hanging="260"/>
+        <w:jc w:val="left"/>
+        <w:rPr/>
+      </w:pPr>
+      <w:r>
+        <w:t>Esta tabla es referenciada por caja_efectivo (cantidad disponible) y por movimientos_efectivo (bitácora de cada cambio de esa cantidad).</w:t>
+      </w:r>
+    </w:p>
+    <w:p>
+      <w:pPr>
+        <w:pStyle w:val="Heading2"/>
+        <w:spacing w:after="150" w:before="300" w:lineRule="auto"/>
+        <w:rPr/>
+      </w:pPr>
+      <w:r>
+        <w:t>4.13 caja_efectivo</w:t>
+      </w:r>
+    </w:p>
+    <w:p>
+      <w:pPr>
+        <w:spacing w:after="120" w:lineRule="auto"/>
+        <w:rPr/>
+      </w:pPr>
+      <w:r>
+        <w:t>Cantidad actual disponible de cada denominación dentro de la máquina, usada para verificar si hay suficiente para dar cambio antes de confirmar una venta en efectivo. Es la fuente de verdad de la cantidad; no se duplica en otra tabla editable.</w:t>
+      </w:r>
+    </w:p>
+    <w:tbl>
+      <w:tblPr>
+        <w:tblStyle w:val="Table11"/>
+        <w:tblW w:w="10240.0" w:type="dxa"/>
+        <w:jc w:val="left"/>
+        <w:tblBorders>
+          <w:top w:color="000000" w:space="0" w:sz="4" w:val="single"/>
+          <w:left w:color="000000" w:space="0" w:sz="4" w:val="single"/>
+          <w:bottom w:color="000000" w:space="0" w:sz="4" w:val="single"/>
+          <w:right w:color="000000" w:space="0" w:sz="4" w:val="single"/>
+          <w:insideH w:color="000000" w:space="0" w:sz="4" w:val="single"/>
+          <w:insideV w:color="000000" w:space="0" w:sz="4" w:val="single"/>
+        </w:tblBorders>
+        <w:tblLayout w:type="fixed"/>
+        <w:tblLook w:val="0000"/>
+      </w:tblPr>
+      <w:tblGrid>
+        <w:gridCol w:w="1700"/>
+        <w:gridCol w:w="1500"/>
+        <w:gridCol w:w="1700"/>
+        <w:gridCol w:w="5340"/>
+        <w:tblGridChange w:id="0">
+          <w:tblGrid>
+            <w:gridCol w:w="1700"/>
+            <w:gridCol w:w="1500"/>
+            <w:gridCol w:w="1700"/>
+            <w:gridCol w:w="5340"/>
+          </w:tblGrid>
+        </w:tblGridChange>
+      </w:tblGrid>
+      <w:tr>
+        <w:trPr>
+          <w:cantSplit w:val="0"/>
+          <w:tblHeader w:val="1"/>
+        </w:trPr>
+        <w:tc>
+          <w:tcPr>
+            <w:shd w:fill="1f3864" w:val="clear"/>
+            <w:tcMar>
+              <w:top w:w="80.0" w:type="dxa"/>
+              <w:left w:w="100.0" w:type="dxa"/>
+              <w:bottom w:w="80.0" w:type="dxa"/>
+              <w:right w:w="100.0" w:type="dxa"/>
+            </w:tcMar>
+            <w:vAlign w:val="center"/>
+          </w:tcPr>
+          <w:p>
+            <w:pPr>
+              <w:rPr/>
+            </w:pPr>
+            <w:r>
+              <w:rPr>
+                <w:rFonts w:ascii="Consolas" w:cs="Consolas" w:eastAsia="Consolas" w:hAnsi="Consolas"/>
+                <w:b w:val="1"/>
+                <w:bCs w:val="1"/>
+                <w:color w:val="ffffff"/>
+                <w:sz w:val="20"/>
+                <w:szCs w:val="20"/>
+                <w:rtl w:val="0"/>
+              </w:rPr>
+              <w:t xml:space="preserve">Atributo</w:t>
+            </w:r>
+            <w:r>
+              <w:rPr>
+                <w:rtl w:val="0"/>
+              </w:rPr>
+            </w:r>
+          </w:p>
+        </w:tc>
+        <w:tc>
+          <w:tcPr>
+            <w:shd w:fill="1f3864" w:val="clear"/>
+            <w:tcMar>
+              <w:top w:w="80.0" w:type="dxa"/>
+              <w:left w:w="100.0" w:type="dxa"/>
+              <w:bottom w:w="80.0" w:type="dxa"/>
+              <w:right w:w="100.0" w:type="dxa"/>
+            </w:tcMar>
+            <w:vAlign w:val="center"/>
+          </w:tcPr>
+          <w:p>
+            <w:pPr>
+              <w:rPr/>
+            </w:pPr>
+            <w:r>
+              <w:rPr>
+                <w:rFonts w:ascii="Consolas" w:cs="Consolas" w:eastAsia="Consolas" w:hAnsi="Consolas"/>
+                <w:b w:val="1"/>
+                <w:bCs w:val="1"/>
+                <w:color w:val="ffffff"/>
+                <w:sz w:val="20"/>
+                <w:szCs w:val="20"/>
+                <w:rtl w:val="0"/>
+              </w:rPr>
+              <w:t xml:space="preserve">Tipo SQLite</w:t>
+            </w:r>
+            <w:r>
+              <w:rPr>
+                <w:rtl w:val="0"/>
+              </w:rPr>
+            </w:r>
+          </w:p>
+        </w:tc>
+        <w:tc>
+          <w:tcPr>
+            <w:shd w:fill="1f3864" w:val="clear"/>
+            <w:tcMar>
+              <w:top w:w="80.0" w:type="dxa"/>
+              <w:left w:w="100.0" w:type="dxa"/>
+              <w:bottom w:w="80.0" w:type="dxa"/>
+              <w:right w:w="100.0" w:type="dxa"/>
+            </w:tcMar>
+            <w:vAlign w:val="center"/>
+          </w:tcPr>
+          <w:p>
+            <w:pPr>
+              <w:rPr/>
+            </w:pPr>
+            <w:r>
+              <w:rPr>
+                <w:rFonts w:ascii="Consolas" w:cs="Consolas" w:eastAsia="Consolas" w:hAnsi="Consolas"/>
+                <w:b w:val="1"/>
+                <w:bCs w:val="1"/>
+                <w:color w:val="ffffff"/>
+                <w:sz w:val="20"/>
+                <w:szCs w:val="20"/>
+                <w:rtl w:val="0"/>
+              </w:rPr>
+              <w:t xml:space="preserve">Llave / Restricción</w:t>
+            </w:r>
+            <w:r>
+              <w:rPr>
+                <w:rtl w:val="0"/>
+              </w:rPr>
+            </w:r>
+          </w:p>
+        </w:tc>
+        <w:tc>
+          <w:tcPr>
+            <w:shd w:fill="1f3864" w:val="clear"/>
+            <w:tcMar>
+              <w:top w:w="80.0" w:type="dxa"/>
+              <w:left w:w="100.0" w:type="dxa"/>
+              <w:bottom w:w="80.0" w:type="dxa"/>
+              <w:right w:w="100.0" w:type="dxa"/>
+            </w:tcMar>
+            <w:vAlign w:val="center"/>
+          </w:tcPr>
+          <w:p>
+            <w:pPr>
+              <w:rPr/>
+            </w:pPr>
+            <w:r>
+              <w:rPr>
+                <w:rFonts w:ascii="Consolas" w:cs="Consolas" w:eastAsia="Consolas" w:hAnsi="Consolas"/>
+                <w:b w:val="1"/>
+                <w:bCs w:val="1"/>
+                <w:color w:val="ffffff"/>
+                <w:sz w:val="20"/>
+                <w:szCs w:val="20"/>
+                <w:rtl w:val="0"/>
+              </w:rPr>
+              <w:t xml:space="preserve">Descripción</w:t>
+            </w:r>
+            <w:r>
+              <w:rPr>
+                <w:rtl w:val="0"/>
+              </w:rPr>
+            </w:r>
+          </w:p>
+        </w:tc>
+      </w:tr>
+      <w:tr>
+        <w:trPr>
+          <w:cantSplit w:val="0"/>
+          <w:tblHeader w:val="0"/>
+        </w:trPr>
+        <w:tc>
+          <w:tcPr>
+            <w:shd w:fill="ffffff" w:val="clear"/>
+            <w:tcMar>
+              <w:top w:w="80.0" w:type="dxa"/>
+              <w:left w:w="100.0" w:type="dxa"/>
+              <w:bottom w:w="80.0" w:type="dxa"/>
+              <w:right w:w="100.0" w:type="dxa"/>
+            </w:tcMar>
+            <w:vAlign w:val="center"/>
+          </w:tcPr>
+          <w:p>
+            <w:pPr>
+              <w:rPr/>
+            </w:pPr>
+            <w:r>
+              <w:rPr>
+                <w:rFonts w:ascii="Consolas" w:hAnsi="Consolas" w:cs="Consolas"/>
+                <w:b/>
+                <w:sz w:val="19"/>
+              </w:rPr>
+              <w:t>id_denominacion</w:t>
+            </w:r>
+          </w:p>
+        </w:tc>
+        <w:tc>
+          <w:tcPr>
+            <w:shd w:fill="ffffff" w:val="clear"/>
+            <w:tcMar>
+              <w:top w:w="80.0" w:type="dxa"/>
+              <w:left w:w="100.0" w:type="dxa"/>
+              <w:bottom w:w="80.0" w:type="dxa"/>
+              <w:right w:w="100.0" w:type="dxa"/>
+            </w:tcMar>
+            <w:vAlign w:val="center"/>
+          </w:tcPr>
+          <w:p>
+            <w:pPr>
+              <w:rPr/>
+            </w:pPr>
+            <w:r>
+              <w:rPr>
+                <w:rFonts w:ascii="Consolas" w:hAnsi="Consolas" w:cs="Consolas"/>
+                <w:b w:val="0"/>
+                <w:sz w:val="19"/>
+              </w:rPr>
+              <w:t>INTEGER</w:t>
+            </w:r>
+          </w:p>
+        </w:tc>
+        <w:tc>
+          <w:tcPr>
+            <w:shd w:fill="ffffff" w:val="clear"/>
+            <w:tcMar>
+              <w:top w:w="80.0" w:type="dxa"/>
+              <w:left w:w="100.0" w:type="dxa"/>
+              <w:bottom w:w="80.0" w:type="dxa"/>
+              <w:right w:w="100.0" w:type="dxa"/>
+            </w:tcMar>
+            <w:vAlign w:val="center"/>
+          </w:tcPr>
+          <w:p>
+            <w:pPr>
+              <w:rPr/>
+            </w:pPr>
+            <w:r>
+              <w:rPr>
+                <w:rFonts w:ascii="Consolas" w:hAnsi="Consolas" w:cs="Consolas"/>
+                <w:b w:val="0"/>
+                <w:sz w:val="19"/>
+              </w:rPr>
+              <w:t>PK, FK → denominaciones.id_denominacion</w:t>
+            </w:r>
+          </w:p>
+        </w:tc>
+        <w:tc>
+          <w:tcPr>
+            <w:shd w:fill="ffffff" w:val="clear"/>
+            <w:tcMar>
+              <w:top w:w="80.0" w:type="dxa"/>
+              <w:left w:w="100.0" w:type="dxa"/>
+              <w:bottom w:w="80.0" w:type="dxa"/>
+              <w:right w:w="100.0" w:type="dxa"/>
+            </w:tcMar>
+            <w:vAlign w:val="center"/>
+          </w:tcPr>
+          <w:p>
+            <w:pPr>
+              <w:rPr/>
+            </w:pPr>
+            <w:r>
+              <w:rPr>
+                <w:b w:val="0"/>
+                <w:sz w:val="19"/>
+              </w:rPr>
+              <w:t>Denominación a la que pertenece este registro de cantidad.</w:t>
+            </w:r>
+          </w:p>
+        </w:tc>
+      </w:tr>
+      <w:tr>
+        <w:trPr>
+          <w:cantSplit w:val="0"/>
+          <w:tblHeader w:val="0"/>
+        </w:trPr>
+        <w:tc>
+          <w:tcPr>
+            <w:shd w:fill="f2f2f2" w:val="clear"/>
+            <w:tcMar>
+              <w:top w:w="80.0" w:type="dxa"/>
+              <w:left w:w="100.0" w:type="dxa"/>
+              <w:bottom w:w="80.0" w:type="dxa"/>
+              <w:right w:w="100.0" w:type="dxa"/>
+            </w:tcMar>
+            <w:vAlign w:val="center"/>
+          </w:tcPr>
+          <w:p>
+            <w:pPr>
+              <w:rPr/>
+            </w:pPr>
+            <w:r>
+              <w:rPr>
+                <w:rFonts w:ascii="Consolas" w:hAnsi="Consolas" w:cs="Consolas"/>
+                <w:b/>
+                <w:sz w:val="19"/>
+              </w:rPr>
+              <w:t>cantidad</w:t>
+            </w:r>
+          </w:p>
+        </w:tc>
+        <w:tc>
+          <w:tcPr>
+            <w:shd w:fill="f2f2f2" w:val="clear"/>
+            <w:tcMar>
+              <w:top w:w="80.0" w:type="dxa"/>
+              <w:left w:w="100.0" w:type="dxa"/>
+              <w:bottom w:w="80.0" w:type="dxa"/>
+              <w:right w:w="100.0" w:type="dxa"/>
+            </w:tcMar>
+            <w:vAlign w:val="center"/>
+          </w:tcPr>
+          <w:p>
+            <w:pPr>
+              <w:rPr/>
+            </w:pPr>
+            <w:r>
+              <w:rPr>
+                <w:rFonts w:ascii="Consolas" w:hAnsi="Consolas" w:cs="Consolas"/>
+                <w:b w:val="0"/>
+                <w:sz w:val="19"/>
+              </w:rPr>
+              <w:t>INTEGER</w:t>
+            </w:r>
+          </w:p>
+        </w:tc>
+        <w:tc>
+          <w:tcPr>
+            <w:shd w:fill="f2f2f2" w:val="clear"/>
+            <w:tcMar>
+              <w:top w:w="80.0" w:type="dxa"/>
+              <w:left w:w="100.0" w:type="dxa"/>
+              <w:bottom w:w="80.0" w:type="dxa"/>
+              <w:right w:w="100.0" w:type="dxa"/>
+            </w:tcMar>
+            <w:vAlign w:val="center"/>
+          </w:tcPr>
+          <w:p>
+            <w:pPr>
+              <w:rPr/>
+            </w:pPr>
+            <w:r>
+              <w:rPr>
+                <w:rFonts w:ascii="Consolas" w:hAnsi="Consolas" w:cs="Consolas"/>
+                <w:b w:val="0"/>
+                <w:sz w:val="19"/>
+              </w:rPr>
+              <w:t>NOT NULL, CHECK &gt;= 0</w:t>
+            </w:r>
+          </w:p>
+        </w:tc>
+        <w:tc>
+          <w:tcPr>
+            <w:shd w:fill="f2f2f2" w:val="clear"/>
+            <w:tcMar>
+              <w:top w:w="80.0" w:type="dxa"/>
+              <w:left w:w="100.0" w:type="dxa"/>
+              <w:bottom w:w="80.0" w:type="dxa"/>
+              <w:right w:w="100.0" w:type="dxa"/>
+            </w:tcMar>
+            <w:vAlign w:val="center"/>
+          </w:tcPr>
+          <w:p>
+            <w:pPr>
+              <w:rPr/>
+            </w:pPr>
+            <w:r>
+              <w:rPr>
+                <w:b w:val="0"/>
+                <w:sz w:val="19"/>
+              </w:rPr>
+              <w:t>Piezas disponibles actualmente en la máquina, tanto para completar pagos como para dar cambio.</w:t>
+            </w:r>
+          </w:p>
+        </w:tc>
+      </w:tr>
+      <w:tr>
+        <w:trPr>
+          <w:cantSplit w:val="0"/>
+          <w:tblHeader w:val="0"/>
+        </w:trPr>
+        <w:tc>
+          <w:tcPr>
+            <w:shd w:fill="ffffff" w:val="clear"/>
+            <w:tcMar>
+              <w:top w:w="80.0" w:type="dxa"/>
+              <w:left w:w="100.0" w:type="dxa"/>
+              <w:bottom w:w="80.0" w:type="dxa"/>
+              <w:right w:w="100.0" w:type="dxa"/>
+            </w:tcMar>
+            <w:vAlign w:val="center"/>
+          </w:tcPr>
+          <w:p>
+            <w:pPr>
+              <w:rPr/>
+            </w:pPr>
+            <w:r>
+              <w:rPr>
+                <w:rFonts w:ascii="Consolas" w:hAnsi="Consolas" w:cs="Consolas"/>
+                <w:b/>
+                <w:sz w:val="19"/>
+              </w:rPr>
+              <w:t>version</w:t>
+            </w:r>
+          </w:p>
+        </w:tc>
+        <w:tc>
+          <w:tcPr>
+            <w:shd w:fill="ffffff" w:val="clear"/>
+            <w:tcMar>
+              <w:top w:w="80.0" w:type="dxa"/>
+              <w:left w:w="100.0" w:type="dxa"/>
+              <w:bottom w:w="80.0" w:type="dxa"/>
+              <w:right w:w="100.0" w:type="dxa"/>
+            </w:tcMar>
+            <w:vAlign w:val="center"/>
+          </w:tcPr>
+          <w:p>
+            <w:pPr>
+              <w:rPr/>
+            </w:pPr>
+            <w:r>
+              <w:rPr>
+                <w:rFonts w:ascii="Consolas" w:hAnsi="Consolas" w:cs="Consolas"/>
+                <w:b w:val="0"/>
+                <w:sz w:val="19"/>
+              </w:rPr>
+              <w:t>INTEGER</w:t>
+            </w:r>
+          </w:p>
+        </w:tc>
+        <w:tc>
+          <w:tcPr>
+            <w:shd w:fill="ffffff" w:val="clear"/>
+            <w:tcMar>
+              <w:top w:w="80.0" w:type="dxa"/>
+              <w:left w:w="100.0" w:type="dxa"/>
+              <w:bottom w:w="80.0" w:type="dxa"/>
+              <w:right w:w="100.0" w:type="dxa"/>
+            </w:tcMar>
+            <w:vAlign w:val="center"/>
+          </w:tcPr>
+          <w:p>
+            <w:pPr>
+              <w:rPr/>
+            </w:pPr>
+            <w:r>
+              <w:rPr>
+                <w:rFonts w:ascii="Consolas" w:hAnsi="Consolas" w:cs="Consolas"/>
+                <w:b w:val="0"/>
+                <w:sz w:val="19"/>
+              </w:rPr>
+              <w:t>NOT NULL</w:t>
+            </w:r>
+          </w:p>
+        </w:tc>
+        <w:tc>
+          <w:tcPr>
+            <w:shd w:fill="ffffff" w:val="clear"/>
+            <w:tcMar>
+              <w:top w:w="80.0" w:type="dxa"/>
+              <w:left w:w="100.0" w:type="dxa"/>
+              <w:bottom w:w="80.0" w:type="dxa"/>
+              <w:right w:w="100.0" w:type="dxa"/>
+            </w:tcMar>
+            <w:vAlign w:val="center"/>
+          </w:tcPr>
+          <w:p>
+            <w:pPr>
+              <w:rPr/>
+            </w:pPr>
+            <w:r>
+              <w:rPr>
+                <w:b w:val="0"/>
+                <w:sz w:val="19"/>
+              </w:rPr>
+              <w:t>Contador de concurrencia optimista, igual que slots.version: detecta si un ajuste desde la web y el cierre de una venta modifican la cantidad al mismo tiempo.</w:t>
+            </w:r>
+          </w:p>
+        </w:tc>
+      </w:tr>
+    </w:tbl>
+    <w:p>
+      <w:pPr>
+        <w:spacing w:after="60" w:before="100" w:lineRule="auto"/>
+        <w:rPr/>
+      </w:pPr>
+      <w:r>
+        <w:rPr>
+          <w:b w:val="1"/>
+          <w:bCs w:val="1"/>
+          <w:i w:val="1"/>
+          <w:iCs w:val="1"/>
+          <w:rtl w:val="0"/>
+        </w:rPr>
+        <w:t xml:space="preserve">Notas de diseño:</w:t>
+      </w:r>
+      <w:r>
+        <w:rPr>
+          <w:rtl w:val="0"/>
+        </w:rPr>
+      </w:r>
+    </w:p>
+    <w:p>
+      <w:pPr>
+        <w:keepNext w:val="0"/>
+        <w:keepLines w:val="0"/>
+        <w:pageBreakBefore w:val="0"/>
+        <w:widowControl w:val="1"/>
+        <w:numPr>
+          <w:ilvl w:val="0"/>
+          <w:numId w:val="1"/>
+        </w:numPr>
+        <w:pBdr>
+          <w:top w:space="0" w:sz="0" w:val="nil"/>
+          <w:left w:space="0" w:sz="0" w:val="nil"/>
+          <w:bottom w:space="0" w:sz="0" w:val="nil"/>
+          <w:right w:space="0" w:sz="0" w:val="nil"/>
+          <w:between w:space="0" w:sz="0" w:val="nil"/>
+        </w:pBdr>
+        <w:shd w:fill="auto" w:val="clear"/>
+        <w:spacing w:after="60" w:before="0" w:line="240" w:lineRule="auto"/>
+        <w:ind w:left="360" w:right="0" w:hanging="260"/>
+        <w:jc w:val="left"/>
+        <w:rPr/>
+      </w:pPr>
+      <w:r>
+        <w:t>La modificación de cantidad desde la web (por ejemplo, para reponer monedas físicamente y así poder dar cambio) actualiza esta tabla directamente y deja evidencia en movimientos_efectivo con motivo AJUSTE.</w:t>
+      </w:r>
+    </w:p>
+    <w:p>
+      <w:pPr>
+        <w:pStyle w:val="Heading2"/>
+        <w:spacing w:after="150" w:before="300" w:lineRule="auto"/>
+        <w:rPr/>
+      </w:pPr>
+      <w:r>
+        <w:t>4.14 movimientos_efectivo</w:t>
+      </w:r>
+    </w:p>
+    <w:p>
+      <w:pPr>
+        <w:spacing w:after="120" w:lineRule="auto"/>
+        <w:rPr/>
+      </w:pPr>
+      <w:r>
+        <w:t>Bitácora de auditoría de cada cambio en caja_efectivo: piezas recibidas como parte de un pago, piezas entregadas como cambio, o ajustes manuales del administrador desde la web. Una sola tabla cubre tanto el detalle de composición de un pago en efectivo (varias piezas por transacción) como el registro de auditoría de la cantidad disponible, para no duplicar la misma información en dos tablas distintas.</w:t>
+      </w:r>
+    </w:p>
+    <w:tbl>
+      <w:tblPr>
+        <w:tblStyle w:val="Table11"/>
+        <w:tblW w:w="10240.0" w:type="dxa"/>
+        <w:jc w:val="left"/>
+        <w:tblBorders>
+          <w:top w:color="000000" w:space="0" w:sz="4" w:val="single"/>
+          <w:left w:color="000000" w:space="0" w:sz="4" w:val="single"/>
+          <w:bottom w:color="000000" w:space="0" w:sz="4" w:val="single"/>
+          <w:right w:color="000000" w:space="0" w:sz="4" w:val="single"/>
+          <w:insideH w:color="000000" w:space="0" w:sz="4" w:val="single"/>
+          <w:insideV w:color="000000" w:space="0" w:sz="4" w:val="single"/>
+        </w:tblBorders>
+        <w:tblLayout w:type="fixed"/>
+        <w:tblLook w:val="0000"/>
+      </w:tblPr>
+      <w:tblGrid>
+        <w:gridCol w:w="1700"/>
+        <w:gridCol w:w="1500"/>
+        <w:gridCol w:w="1700"/>
+        <w:gridCol w:w="5340"/>
+        <w:tblGridChange w:id="0">
+          <w:tblGrid>
+            <w:gridCol w:w="1700"/>
+            <w:gridCol w:w="1500"/>
+            <w:gridCol w:w="1700"/>
+            <w:gridCol w:w="5340"/>
+          </w:tblGrid>
+        </w:tblGridChange>
+      </w:tblGrid>
+      <w:tr>
+        <w:trPr>
+          <w:cantSplit w:val="0"/>
+          <w:tblHeader w:val="1"/>
+        </w:trPr>
+        <w:tc>
+          <w:tcPr>
+            <w:shd w:fill="1f3864" w:val="clear"/>
+            <w:tcMar>
+              <w:top w:w="80.0" w:type="dxa"/>
+              <w:left w:w="100.0" w:type="dxa"/>
+              <w:bottom w:w="80.0" w:type="dxa"/>
+              <w:right w:w="100.0" w:type="dxa"/>
+            </w:tcMar>
+            <w:vAlign w:val="center"/>
+          </w:tcPr>
+          <w:p>
+            <w:pPr>
+              <w:rPr/>
+            </w:pPr>
+            <w:r>
+              <w:rPr>
+                <w:rFonts w:ascii="Consolas" w:cs="Consolas" w:eastAsia="Consolas" w:hAnsi="Consolas"/>
+                <w:b w:val="1"/>
+                <w:bCs w:val="1"/>
+                <w:color w:val="ffffff"/>
+                <w:sz w:val="20"/>
+                <w:szCs w:val="20"/>
+                <w:rtl w:val="0"/>
+              </w:rPr>
+              <w:t xml:space="preserve">Atributo</w:t>
+            </w:r>
+            <w:r>
+              <w:rPr>
+                <w:rtl w:val="0"/>
+              </w:rPr>
+            </w:r>
+          </w:p>
+        </w:tc>
+        <w:tc>
+          <w:tcPr>
+            <w:shd w:fill="1f3864" w:val="clear"/>
+            <w:tcMar>
+              <w:top w:w="80.0" w:type="dxa"/>
+              <w:left w:w="100.0" w:type="dxa"/>
+              <w:bottom w:w="80.0" w:type="dxa"/>
+              <w:right w:w="100.0" w:type="dxa"/>
+            </w:tcMar>
+            <w:vAlign w:val="center"/>
+          </w:tcPr>
+          <w:p>
+            <w:pPr>
+              <w:rPr/>
+            </w:pPr>
+            <w:r>
+              <w:rPr>
+                <w:rFonts w:ascii="Consolas" w:cs="Consolas" w:eastAsia="Consolas" w:hAnsi="Consolas"/>
+                <w:b w:val="1"/>
+                <w:bCs w:val="1"/>
+                <w:color w:val="ffffff"/>
+                <w:sz w:val="20"/>
+                <w:szCs w:val="20"/>
+                <w:rtl w:val="0"/>
+              </w:rPr>
+              <w:t xml:space="preserve">Tipo SQLite</w:t>
+            </w:r>
+            <w:r>
+              <w:rPr>
+                <w:rtl w:val="0"/>
+              </w:rPr>
+            </w:r>
+          </w:p>
+        </w:tc>
+        <w:tc>
+          <w:tcPr>
+            <w:shd w:fill="1f3864" w:val="clear"/>
+            <w:tcMar>
+              <w:top w:w="80.0" w:type="dxa"/>
+              <w:left w:w="100.0" w:type="dxa"/>
+              <w:bottom w:w="80.0" w:type="dxa"/>
+              <w:right w:w="100.0" w:type="dxa"/>
+            </w:tcMar>
+            <w:vAlign w:val="center"/>
+          </w:tcPr>
+          <w:p>
+            <w:pPr>
+              <w:rPr/>
+            </w:pPr>
+            <w:r>
+              <w:rPr>
+                <w:rFonts w:ascii="Consolas" w:cs="Consolas" w:eastAsia="Consolas" w:hAnsi="Consolas"/>
+                <w:b w:val="1"/>
+                <w:bCs w:val="1"/>
+                <w:color w:val="ffffff"/>
+                <w:sz w:val="20"/>
+                <w:szCs w:val="20"/>
+                <w:rtl w:val="0"/>
+              </w:rPr>
+              <w:t xml:space="preserve">Llave / Restricción</w:t>
+            </w:r>
+            <w:r>
+              <w:rPr>
+                <w:rtl w:val="0"/>
+              </w:rPr>
+            </w:r>
+          </w:p>
+        </w:tc>
+        <w:tc>
+          <w:tcPr>
+            <w:shd w:fill="1f3864" w:val="clear"/>
+            <w:tcMar>
+              <w:top w:w="80.0" w:type="dxa"/>
+              <w:left w:w="100.0" w:type="dxa"/>
+              <w:bottom w:w="80.0" w:type="dxa"/>
+              <w:right w:w="100.0" w:type="dxa"/>
+            </w:tcMar>
+            <w:vAlign w:val="center"/>
+          </w:tcPr>
+          <w:p>
+            <w:pPr>
+              <w:rPr/>
+            </w:pPr>
+            <w:r>
+              <w:rPr>
+                <w:rFonts w:ascii="Consolas" w:cs="Consolas" w:eastAsia="Consolas" w:hAnsi="Consolas"/>
+                <w:b w:val="1"/>
+                <w:bCs w:val="1"/>
+                <w:color w:val="ffffff"/>
+                <w:sz w:val="20"/>
+                <w:szCs w:val="20"/>
+                <w:rtl w:val="0"/>
+              </w:rPr>
+              <w:t xml:space="preserve">Descripción</w:t>
+            </w:r>
+            <w:r>
+              <w:rPr>
+                <w:rtl w:val="0"/>
+              </w:rPr>
+            </w:r>
+          </w:p>
+        </w:tc>
+      </w:tr>
+      <w:tr>
+        <w:trPr>
+          <w:cantSplit w:val="0"/>
+          <w:tblHeader w:val="0"/>
+        </w:trPr>
+        <w:tc>
+          <w:tcPr>
+            <w:shd w:fill="ffffff" w:val="clear"/>
+            <w:tcMar>
+              <w:top w:w="80.0" w:type="dxa"/>
+              <w:left w:w="100.0" w:type="dxa"/>
+              <w:bottom w:w="80.0" w:type="dxa"/>
+              <w:right w:w="100.0" w:type="dxa"/>
+            </w:tcMar>
+            <w:vAlign w:val="center"/>
+          </w:tcPr>
+          <w:p>
+            <w:pPr>
+              <w:rPr/>
+            </w:pPr>
+            <w:r>
+              <w:rPr>
+                <w:rFonts w:ascii="Consolas" w:hAnsi="Consolas" w:cs="Consolas"/>
+                <w:b/>
+                <w:sz w:val="19"/>
+              </w:rPr>
+              <w:t>id_movimiento_efectivo</w:t>
+            </w:r>
+          </w:p>
+        </w:tc>
+        <w:tc>
+          <w:tcPr>
+            <w:shd w:fill="ffffff" w:val="clear"/>
+            <w:tcMar>
+              <w:top w:w="80.0" w:type="dxa"/>
+              <w:left w:w="100.0" w:type="dxa"/>
+              <w:bottom w:w="80.0" w:type="dxa"/>
+              <w:right w:w="100.0" w:type="dxa"/>
+            </w:tcMar>
+            <w:vAlign w:val="center"/>
+          </w:tcPr>
+          <w:p>
+            <w:pPr>
+              <w:rPr/>
+            </w:pPr>
+            <w:r>
+              <w:rPr>
+                <w:rFonts w:ascii="Consolas" w:hAnsi="Consolas" w:cs="Consolas"/>
+                <w:b w:val="0"/>
+                <w:sz w:val="19"/>
+              </w:rPr>
+              <w:t>INTEGER</w:t>
+            </w:r>
+          </w:p>
+        </w:tc>
+        <w:tc>
+          <w:tcPr>
+            <w:shd w:fill="ffffff" w:val="clear"/>
+            <w:tcMar>
+              <w:top w:w="80.0" w:type="dxa"/>
+              <w:left w:w="100.0" w:type="dxa"/>
+              <w:bottom w:w="80.0" w:type="dxa"/>
+              <w:right w:w="100.0" w:type="dxa"/>
+            </w:tcMar>
+            <w:vAlign w:val="center"/>
+          </w:tcPr>
+          <w:p>
+            <w:pPr>
+              <w:rPr/>
+            </w:pPr>
+            <w:r>
+              <w:rPr>
+                <w:rFonts w:ascii="Consolas" w:hAnsi="Consolas" w:cs="Consolas"/>
+                <w:b w:val="0"/>
+                <w:sz w:val="19"/>
+              </w:rPr>
+              <w:t>PK, AUTOINCREMENT</w:t>
+            </w:r>
+          </w:p>
+        </w:tc>
+        <w:tc>
+          <w:tcPr>
+            <w:shd w:fill="ffffff" w:val="clear"/>
+            <w:tcMar>
+              <w:top w:w="80.0" w:type="dxa"/>
+              <w:left w:w="100.0" w:type="dxa"/>
+              <w:bottom w:w="80.0" w:type="dxa"/>
+              <w:right w:w="100.0" w:type="dxa"/>
+            </w:tcMar>
+            <w:vAlign w:val="center"/>
+          </w:tcPr>
+          <w:p>
+            <w:pPr>
+              <w:rPr/>
+            </w:pPr>
+            <w:r>
+              <w:rPr>
+                <w:b w:val="0"/>
+                <w:sz w:val="19"/>
+              </w:rPr>
+              <w:t>Identificador del movimiento.</w:t>
+            </w:r>
+          </w:p>
+        </w:tc>
+      </w:tr>
+      <w:tr>
+        <w:trPr>
+          <w:cantSplit w:val="0"/>
+          <w:tblHeader w:val="0"/>
+        </w:trPr>
+        <w:tc>
+          <w:tcPr>
+            <w:shd w:fill="f2f2f2" w:val="clear"/>
+            <w:tcMar>
+              <w:top w:w="80.0" w:type="dxa"/>
+              <w:left w:w="100.0" w:type="dxa"/>
+              <w:bottom w:w="80.0" w:type="dxa"/>
+              <w:right w:w="100.0" w:type="dxa"/>
+            </w:tcMar>
+            <w:vAlign w:val="center"/>
+          </w:tcPr>
+          <w:p>
+            <w:pPr>
+              <w:rPr/>
+            </w:pPr>
+            <w:r>
+              <w:rPr>
+                <w:rFonts w:ascii="Consolas" w:hAnsi="Consolas" w:cs="Consolas"/>
+                <w:b/>
+                <w:sz w:val="19"/>
+              </w:rPr>
+              <w:t>id_denominacion</w:t>
+            </w:r>
+          </w:p>
+        </w:tc>
+        <w:tc>
+          <w:tcPr>
+            <w:shd w:fill="f2f2f2" w:val="clear"/>
+            <w:tcMar>
+              <w:top w:w="80.0" w:type="dxa"/>
+              <w:left w:w="100.0" w:type="dxa"/>
+              <w:bottom w:w="80.0" w:type="dxa"/>
+              <w:right w:w="100.0" w:type="dxa"/>
+            </w:tcMar>
+            <w:vAlign w:val="center"/>
+          </w:tcPr>
+          <w:p>
+            <w:pPr>
+              <w:rPr/>
+            </w:pPr>
+            <w:r>
+              <w:rPr>
+                <w:rFonts w:ascii="Consolas" w:hAnsi="Consolas" w:cs="Consolas"/>
+                <w:b w:val="0"/>
+                <w:sz w:val="19"/>
+              </w:rPr>
+              <w:t>INTEGER</w:t>
+            </w:r>
+          </w:p>
+        </w:tc>
+        <w:tc>
+          <w:tcPr>
+            <w:shd w:fill="f2f2f2" w:val="clear"/>
+            <w:tcMar>
+              <w:top w:w="80.0" w:type="dxa"/>
+              <w:left w:w="100.0" w:type="dxa"/>
+              <w:bottom w:w="80.0" w:type="dxa"/>
+              <w:right w:w="100.0" w:type="dxa"/>
+            </w:tcMar>
+            <w:vAlign w:val="center"/>
+          </w:tcPr>
+          <w:p>
+            <w:pPr>
+              <w:rPr/>
+            </w:pPr>
+            <w:r>
+              <w:rPr>
+                <w:rFonts w:ascii="Consolas" w:hAnsi="Consolas" w:cs="Consolas"/>
+                <w:b w:val="0"/>
+                <w:sz w:val="19"/>
+              </w:rPr>
+              <w:t>NOT NULL, FK → denominaciones.id_denominacion</w:t>
+            </w:r>
+          </w:p>
+        </w:tc>
+        <w:tc>
+          <w:tcPr>
+            <w:shd w:fill="f2f2f2" w:val="clear"/>
+            <w:tcMar>
+              <w:top w:w="80.0" w:type="dxa"/>
+              <w:left w:w="100.0" w:type="dxa"/>
+              <w:bottom w:w="80.0" w:type="dxa"/>
+              <w:right w:w="100.0" w:type="dxa"/>
+            </w:tcMar>
+            <w:vAlign w:val="center"/>
+          </w:tcPr>
+          <w:p>
+            <w:pPr>
+              <w:rPr/>
+            </w:pPr>
+            <w:r>
+              <w:rPr>
+                <w:b w:val="0"/>
+                <w:sz w:val="19"/>
+              </w:rPr>
+              <w:t>Denominación afectada por el movimiento.</w:t>
+            </w:r>
+          </w:p>
+        </w:tc>
+      </w:tr>
+      <w:tr>
+        <w:trPr>
+          <w:cantSplit w:val="0"/>
+          <w:tblHeader w:val="0"/>
+        </w:trPr>
+        <w:tc>
+          <w:tcPr>
+            <w:shd w:fill="ffffff" w:val="clear"/>
+            <w:tcMar>
+              <w:top w:w="80.0" w:type="dxa"/>
+              <w:left w:w="100.0" w:type="dxa"/>
+              <w:bottom w:w="80.0" w:type="dxa"/>
+              <w:right w:w="100.0" w:type="dxa"/>
+            </w:tcMar>
+            <w:vAlign w:val="center"/>
+          </w:tcPr>
+          <w:p>
+            <w:pPr>
+              <w:rPr/>
+            </w:pPr>
+            <w:r>
+              <w:rPr>
+                <w:rFonts w:ascii="Consolas" w:hAnsi="Consolas" w:cs="Consolas"/>
+                <w:b/>
+                <w:sz w:val="19"/>
+              </w:rPr>
+              <w:t>id_transaccion</w:t>
+            </w:r>
+          </w:p>
+        </w:tc>
+        <w:tc>
+          <w:tcPr>
+            <w:shd w:fill="ffffff" w:val="clear"/>
+            <w:tcMar>
+              <w:top w:w="80.0" w:type="dxa"/>
+              <w:left w:w="100.0" w:type="dxa"/>
+              <w:bottom w:w="80.0" w:type="dxa"/>
+              <w:right w:w="100.0" w:type="dxa"/>
+            </w:tcMar>
+            <w:vAlign w:val="center"/>
+          </w:tcPr>
+          <w:p>
+            <w:pPr>
+              <w:rPr/>
+            </w:pPr>
+            <w:r>
+              <w:rPr>
+                <w:rFonts w:ascii="Consolas" w:hAnsi="Consolas" w:cs="Consolas"/>
+                <w:b w:val="0"/>
+                <w:sz w:val="19"/>
+              </w:rPr>
+              <w:t>INTEGER</w:t>
+            </w:r>
+          </w:p>
+        </w:tc>
+        <w:tc>
+          <w:tcPr>
+            <w:shd w:fill="ffffff" w:val="clear"/>
+            <w:tcMar>
+              <w:top w:w="80.0" w:type="dxa"/>
+              <w:left w:w="100.0" w:type="dxa"/>
+              <w:bottom w:w="80.0" w:type="dxa"/>
+              <w:right w:w="100.0" w:type="dxa"/>
+            </w:tcMar>
+            <w:vAlign w:val="center"/>
+          </w:tcPr>
+          <w:p>
+            <w:pPr>
+              <w:rPr/>
+            </w:pPr>
+            <w:r>
+              <w:rPr>
+                <w:rFonts w:ascii="Consolas" w:hAnsi="Consolas" w:cs="Consolas"/>
+                <w:b w:val="0"/>
+                <w:sz w:val="19"/>
+              </w:rPr>
+              <w:t>FK → transacciones.id_transaccion (NULL)</w:t>
+            </w:r>
+          </w:p>
+        </w:tc>
+        <w:tc>
+          <w:tcPr>
+            <w:shd w:fill="ffffff" w:val="clear"/>
+            <w:tcMar>
+              <w:top w:w="80.0" w:type="dxa"/>
+              <w:left w:w="100.0" w:type="dxa"/>
+              <w:bottom w:w="80.0" w:type="dxa"/>
+              <w:right w:w="100.0" w:type="dxa"/>
+            </w:tcMar>
+            <w:vAlign w:val="center"/>
+          </w:tcPr>
+          <w:p>
+            <w:pPr>
+              <w:rPr/>
+            </w:pPr>
+            <w:r>
+              <w:rPr>
+                <w:b w:val="0"/>
+                <w:sz w:val="19"/>
+              </w:rPr>
+              <w:t>Compra que originó el movimiento; NULL si es un ajuste manual sin venta asociada.</w:t>
+            </w:r>
+          </w:p>
+        </w:tc>
+      </w:tr>
+      <w:tr>
+        <w:trPr>
+          <w:cantSplit w:val="0"/>
+          <w:tblHeader w:val="0"/>
+        </w:trPr>
+        <w:tc>
+          <w:tcPr>
+            <w:shd w:fill="f2f2f2" w:val="clear"/>
+            <w:tcMar>
+              <w:top w:w="80.0" w:type="dxa"/>
+              <w:left w:w="100.0" w:type="dxa"/>
+              <w:bottom w:w="80.0" w:type="dxa"/>
+              <w:right w:w="100.0" w:type="dxa"/>
+            </w:tcMar>
+            <w:vAlign w:val="center"/>
+          </w:tcPr>
+          <w:p>
+            <w:pPr>
+              <w:rPr/>
+            </w:pPr>
+            <w:r>
+              <w:rPr>
+                <w:rFonts w:ascii="Consolas" w:hAnsi="Consolas" w:cs="Consolas"/>
+                <w:b/>
+                <w:sz w:val="19"/>
+              </w:rPr>
+              <w:t>delta</w:t>
+            </w:r>
+          </w:p>
+        </w:tc>
+        <w:tc>
+          <w:tcPr>
+            <w:shd w:fill="f2f2f2" w:val="clear"/>
+            <w:tcMar>
+              <w:top w:w="80.0" w:type="dxa"/>
+              <w:left w:w="100.0" w:type="dxa"/>
+              <w:bottom w:w="80.0" w:type="dxa"/>
+              <w:right w:w="100.0" w:type="dxa"/>
+            </w:tcMar>
+            <w:vAlign w:val="center"/>
+          </w:tcPr>
+          <w:p>
+            <w:pPr>
+              <w:rPr/>
+            </w:pPr>
+            <w:r>
+              <w:rPr>
+                <w:rFonts w:ascii="Consolas" w:hAnsi="Consolas" w:cs="Consolas"/>
+                <w:b w:val="0"/>
+                <w:sz w:val="19"/>
+              </w:rPr>
+              <w:t>INTEGER</w:t>
+            </w:r>
+          </w:p>
+        </w:tc>
+        <w:tc>
+          <w:tcPr>
+            <w:shd w:fill="f2f2f2" w:val="clear"/>
+            <w:tcMar>
+              <w:top w:w="80.0" w:type="dxa"/>
+              <w:left w:w="100.0" w:type="dxa"/>
+              <w:bottom w:w="80.0" w:type="dxa"/>
+              <w:right w:w="100.0" w:type="dxa"/>
+            </w:tcMar>
+            <w:vAlign w:val="center"/>
+          </w:tcPr>
+          <w:p>
+            <w:pPr>
+              <w:rPr/>
+            </w:pPr>
+            <w:r>
+              <w:rPr>
+                <w:rFonts w:ascii="Consolas" w:hAnsi="Consolas" w:cs="Consolas"/>
+                <w:b w:val="0"/>
+                <w:sz w:val="19"/>
+              </w:rPr>
+              <w:t>NOT NULL</w:t>
+            </w:r>
+          </w:p>
+        </w:tc>
+        <w:tc>
+          <w:tcPr>
+            <w:shd w:fill="f2f2f2" w:val="clear"/>
+            <w:tcMar>
+              <w:top w:w="80.0" w:type="dxa"/>
+              <w:left w:w="100.0" w:type="dxa"/>
+              <w:bottom w:w="80.0" w:type="dxa"/>
+              <w:right w:w="100.0" w:type="dxa"/>
+            </w:tcMar>
+            <w:vAlign w:val="center"/>
+          </w:tcPr>
+          <w:p>
+            <w:pPr>
+              <w:rPr/>
+            </w:pPr>
+            <w:r>
+              <w:rPr>
+                <w:b w:val="0"/>
+                <w:sz w:val="19"/>
+              </w:rPr>
+              <w:t>Piezas agregadas (positivo, pago recibido) o retiradas (negativo, cambio entregado o ajuste) de caja_efectivo.</w:t>
+            </w:r>
+          </w:p>
+        </w:tc>
+      </w:tr>
+      <w:tr>
+        <w:trPr>
+          <w:cantSplit w:val="0"/>
+          <w:tblHeader w:val="0"/>
+        </w:trPr>
+        <w:tc>
+          <w:tcPr>
+            <w:shd w:fill="ffffff" w:val="clear"/>
+            <w:tcMar>
+              <w:top w:w="80.0" w:type="dxa"/>
+              <w:left w:w="100.0" w:type="dxa"/>
+              <w:bottom w:w="80.0" w:type="dxa"/>
+              <w:right w:w="100.0" w:type="dxa"/>
+            </w:tcMar>
+            <w:vAlign w:val="center"/>
+          </w:tcPr>
+          <w:p>
+            <w:pPr>
+              <w:rPr/>
+            </w:pPr>
+            <w:r>
+              <w:rPr>
+                <w:rFonts w:ascii="Consolas" w:hAnsi="Consolas" w:cs="Consolas"/>
+                <w:b/>
+                <w:sz w:val="19"/>
+              </w:rPr>
+              <w:t>motivo</w:t>
+            </w:r>
+          </w:p>
+        </w:tc>
+        <w:tc>
+          <w:tcPr>
+            <w:shd w:fill="ffffff" w:val="clear"/>
+            <w:tcMar>
+              <w:top w:w="80.0" w:type="dxa"/>
+              <w:left w:w="100.0" w:type="dxa"/>
+              <w:bottom w:w="80.0" w:type="dxa"/>
+              <w:right w:w="100.0" w:type="dxa"/>
+            </w:tcMar>
+            <w:vAlign w:val="center"/>
+          </w:tcPr>
+          <w:p>
+            <w:pPr>
+              <w:rPr/>
+            </w:pPr>
+            <w:r>
+              <w:rPr>
+                <w:rFonts w:ascii="Consolas" w:hAnsi="Consolas" w:cs="Consolas"/>
+                <w:b w:val="0"/>
+                <w:sz w:val="19"/>
+              </w:rPr>
+              <w:t>TEXT</w:t>
+            </w:r>
+          </w:p>
+        </w:tc>
+        <w:tc>
+          <w:tcPr>
+            <w:shd w:fill="ffffff" w:val="clear"/>
+            <w:tcMar>
+              <w:top w:w="80.0" w:type="dxa"/>
+              <w:left w:w="100.0" w:type="dxa"/>
+              <w:bottom w:w="80.0" w:type="dxa"/>
+              <w:right w:w="100.0" w:type="dxa"/>
+            </w:tcMar>
+            <w:vAlign w:val="center"/>
+          </w:tcPr>
+          <w:p>
+            <w:pPr>
+              <w:rPr/>
+            </w:pPr>
+            <w:r>
+              <w:rPr>
+                <w:rFonts w:ascii="Consolas" w:hAnsi="Consolas" w:cs="Consolas"/>
+                <w:b w:val="0"/>
+                <w:sz w:val="19"/>
+              </w:rPr>
+              <w:t>NOT NULL, CHECK IN ('PAGO_RECIBIDO','CAMBIO_ENTREGADO','AJUSTE')</w:t>
+            </w:r>
+          </w:p>
+        </w:tc>
+        <w:tc>
+          <w:tcPr>
+            <w:shd w:fill="ffffff" w:val="clear"/>
+            <w:tcMar>
+              <w:top w:w="80.0" w:type="dxa"/>
+              <w:left w:w="100.0" w:type="dxa"/>
+              <w:bottom w:w="80.0" w:type="dxa"/>
+              <w:right w:w="100.0" w:type="dxa"/>
+            </w:tcMar>
+            <w:vAlign w:val="center"/>
+          </w:tcPr>
+          <w:p>
+            <w:pPr>
+              <w:rPr/>
+            </w:pPr>
+            <w:r>
+              <w:rPr>
+                <w:b w:val="0"/>
+                <w:sz w:val="19"/>
+              </w:rPr>
+              <w:t>Causa del movimiento.</w:t>
+            </w:r>
+          </w:p>
+        </w:tc>
+      </w:tr>
+      <w:tr>
+        <w:trPr>
+          <w:cantSplit w:val="0"/>
+          <w:tblHeader w:val="0"/>
+        </w:trPr>
+        <w:tc>
+          <w:tcPr>
+            <w:shd w:fill="ffffff" w:val="clear"/>
+            <w:tcMar>
+              <w:top w:w="80.0" w:type="dxa"/>
+              <w:left w:w="100.0" w:type="dxa"/>
+              <w:bottom w:w="80.0" w:type="dxa"/>
+              <w:right w:w="100.0" w:type="dxa"/>
+            </w:tcMar>
+            <w:vAlign w:val="center"/>
+          </w:tcPr>
+          <w:p>
+            <w:pPr>
+              <w:rPr/>
+            </w:pPr>
+            <w:r>
+              <w:rPr>
+                <w:rFonts w:ascii="Consolas" w:hAnsi="Consolas" w:cs="Consolas"/>
+                <w:b/>
+                <w:sz w:val="19"/>
+              </w:rPr>
+              <w:t>operador</w:t>
+            </w:r>
+          </w:p>
+        </w:tc>
+        <w:tc>
+          <w:tcPr>
+            <w:shd w:fill="ffffff" w:val="clear"/>
+            <w:tcMar>
+              <w:top w:w="80.0" w:type="dxa"/>
+              <w:left w:w="100.0" w:type="dxa"/>
+              <w:bottom w:w="80.0" w:type="dxa"/>
+              <w:right w:w="100.0" w:type="dxa"/>
+            </w:tcMar>
+            <w:vAlign w:val="center"/>
+          </w:tcPr>
+          <w:p>
+            <w:pPr>
+              <w:rPr/>
+            </w:pPr>
+            <w:r>
+              <w:rPr>
+                <w:rFonts w:ascii="Consolas" w:hAnsi="Consolas" w:cs="Consolas"/>
+                <w:b w:val="0"/>
+                <w:sz w:val="19"/>
+              </w:rPr>
+              <w:t>INTEGER</w:t>
+            </w:r>
+          </w:p>
+        </w:tc>
+        <w:tc>
+          <w:tcPr>
+            <w:shd w:fill="ffffff" w:val="clear"/>
+            <w:tcMar>
+              <w:top w:w="80.0" w:type="dxa"/>
+              <w:left w:w="100.0" w:type="dxa"/>
+              <w:bottom w:w="80.0" w:type="dxa"/>
+              <w:right w:w="100.0" w:type="dxa"/>
+            </w:tcMar>
+            <w:vAlign w:val="center"/>
+          </w:tcPr>
+          <w:p>
+            <w:pPr>
+              <w:rPr/>
+            </w:pPr>
+            <w:r>
+              <w:rPr>
+                <w:rFonts w:ascii="Consolas" w:hAnsi="Consolas" w:cs="Consolas"/>
+                <w:b w:val="0"/>
+                <w:sz w:val="19"/>
+              </w:rPr>
+              <w:t>FK → administradores.id_admin (NULL)</w:t>
+            </w:r>
+          </w:p>
+        </w:tc>
+        <w:tc>
+          <w:tcPr>
+            <w:shd w:fill="ffffff" w:val="clear"/>
+            <w:tcMar>
+              <w:top w:w="80.0" w:type="dxa"/>
+              <w:left w:w="100.0" w:type="dxa"/>
+              <w:bottom w:w="80.0" w:type="dxa"/>
+              <w:right w:w="100.0" w:type="dxa"/>
+            </w:tcMar>
+            <w:vAlign w:val="center"/>
+          </w:tcPr>
+          <w:p>
+            <w:pPr>
+              <w:rPr/>
+            </w:pPr>
+            <w:r>
+              <w:rPr>
+                <w:b w:val="0"/>
+                <w:sz w:val="19"/>
+              </w:rPr>
+              <w:t>Administrador responsable si fue un ajuste manual; NULL si fue automático (parte de una venta).</w:t>
+            </w:r>
+          </w:p>
+        </w:tc>
+      </w:tr>
+      <w:tr>
+        <w:trPr>
+          <w:cantSplit w:val="0"/>
+          <w:tblHeader w:val="0"/>
+        </w:trPr>
+        <w:tc>
+          <w:tcPr>
+            <w:shd w:fill="ffffff" w:val="clear"/>
+            <w:tcMar>
+              <w:top w:w="80.0" w:type="dxa"/>
+              <w:left w:w="100.0" w:type="dxa"/>
+              <w:bottom w:w="80.0" w:type="dxa"/>
+              <w:right w:w="100.0" w:type="dxa"/>
+            </w:tcMar>
+            <w:vAlign w:val="center"/>
+          </w:tcPr>
+          <w:p>
+            <w:pPr>
+              <w:rPr/>
+            </w:pPr>
+            <w:r>
+              <w:rPr>
+                <w:rFonts w:ascii="Consolas" w:hAnsi="Consolas" w:cs="Consolas"/>
+                <w:b/>
+                <w:sz w:val="19"/>
+              </w:rPr>
+              <w:t>request_id</w:t>
+            </w:r>
+          </w:p>
+        </w:tc>
+        <w:tc>
+          <w:tcPr>
+            <w:shd w:fill="ffffff" w:val="clear"/>
+            <w:tcMar>
+              <w:top w:w="80.0" w:type="dxa"/>
+              <w:left w:w="100.0" w:type="dxa"/>
+              <w:bottom w:w="80.0" w:type="dxa"/>
+              <w:right w:w="100.0" w:type="dxa"/>
+            </w:tcMar>
+            <w:vAlign w:val="center"/>
+          </w:tcPr>
+          <w:p>
+            <w:pPr>
+              <w:rPr/>
+            </w:pPr>
+            <w:r>
+              <w:rPr>
+                <w:rFonts w:ascii="Consolas" w:hAnsi="Consolas" w:cs="Consolas"/>
+                <w:b w:val="0"/>
+                <w:sz w:val="19"/>
+              </w:rPr>
+              <w:t>TEXT</w:t>
+            </w:r>
+          </w:p>
+        </w:tc>
+        <w:tc>
+          <w:tcPr>
+            <w:shd w:fill="ffffff" w:val="clear"/>
+            <w:tcMar>
+              <w:top w:w="80.0" w:type="dxa"/>
+              <w:left w:w="100.0" w:type="dxa"/>
+              <w:bottom w:w="80.0" w:type="dxa"/>
+              <w:right w:w="100.0" w:type="dxa"/>
+            </w:tcMar>
+            <w:vAlign w:val="center"/>
+          </w:tcPr>
+          <w:p>
+            <w:pPr>
+              <w:rPr/>
+            </w:pPr>
+            <w:r>
+              <w:rPr>
+                <w:rFonts w:ascii="Consolas" w:hAnsi="Consolas" w:cs="Consolas"/>
+                <w:b w:val="0"/>
+                <w:sz w:val="19"/>
+              </w:rPr>
+              <w:t>UNIQUE (NULL)</w:t>
+            </w:r>
+          </w:p>
+        </w:tc>
+        <w:tc>
+          <w:tcPr>
+            <w:shd w:fill="ffffff" w:val="clear"/>
+            <w:tcMar>
+              <w:top w:w="80.0" w:type="dxa"/>
+              <w:left w:w="100.0" w:type="dxa"/>
+              <w:bottom w:w="80.0" w:type="dxa"/>
+              <w:right w:w="100.0" w:type="dxa"/>
+            </w:tcMar>
+            <w:vAlign w:val="center"/>
+          </w:tcPr>
+          <w:p>
+            <w:pPr>
+              <w:rPr/>
+            </w:pPr>
+            <w:r>
+              <w:rPr>
+                <w:b w:val="0"/>
+                <w:sz w:val="19"/>
+              </w:rPr>
+              <w:t>Identificador de idempotencia; en la práctica solo se manda en ajustes hechos desde la web.</w:t>
+            </w:r>
+          </w:p>
+        </w:tc>
+      </w:tr>
+      <w:tr>
+        <w:trPr>
+          <w:cantSplit w:val="0"/>
+          <w:tblHeader w:val="0"/>
+        </w:trPr>
+        <w:tc>
+          <w:tcPr>
+            <w:shd w:fill="ffffff" w:val="clear"/>
+            <w:tcMar>
+              <w:top w:w="80.0" w:type="dxa"/>
+              <w:left w:w="100.0" w:type="dxa"/>
+              <w:bottom w:w="80.0" w:type="dxa"/>
+              <w:right w:w="100.0" w:type="dxa"/>
+            </w:tcMar>
+            <w:vAlign w:val="center"/>
+          </w:tcPr>
+          <w:p>
+            <w:pPr>
+              <w:rPr/>
+            </w:pPr>
+            <w:r>
+              <w:rPr>
+                <w:rFonts w:ascii="Consolas" w:hAnsi="Consolas" w:cs="Consolas"/>
+                <w:b/>
+                <w:sz w:val="19"/>
+              </w:rPr>
+              <w:t>secuencia</w:t>
+            </w:r>
+          </w:p>
+        </w:tc>
+        <w:tc>
+          <w:tcPr>
+            <w:shd w:fill="ffffff" w:val="clear"/>
+            <w:tcMar>
+              <w:top w:w="80.0" w:type="dxa"/>
+              <w:left w:w="100.0" w:type="dxa"/>
+              <w:bottom w:w="80.0" w:type="dxa"/>
+              <w:right w:w="100.0" w:type="dxa"/>
+            </w:tcMar>
+            <w:vAlign w:val="center"/>
+          </w:tcPr>
+          <w:p>
+            <w:pPr>
+              <w:rPr/>
+            </w:pPr>
+            <w:r>
+              <w:rPr>
+                <w:rFonts w:ascii="Consolas" w:hAnsi="Consolas" w:cs="Consolas"/>
+                <w:b w:val="0"/>
+                <w:sz w:val="19"/>
+              </w:rPr>
+              <w:t>INTEGER</w:t>
+            </w:r>
+          </w:p>
+        </w:tc>
+        <w:tc>
+          <w:tcPr>
+            <w:shd w:fill="ffffff" w:val="clear"/>
+            <w:tcMar>
+              <w:top w:w="80.0" w:type="dxa"/>
+              <w:left w:w="100.0" w:type="dxa"/>
+              <w:bottom w:w="80.0" w:type="dxa"/>
+              <w:right w:w="100.0" w:type="dxa"/>
+            </w:tcMar>
+            <w:vAlign w:val="center"/>
+          </w:tcPr>
+          <w:p>
+            <w:pPr>
+              <w:rPr/>
+            </w:pPr>
+            <w:r>
+              <w:rPr>
+                <w:rFonts w:ascii="Consolas" w:hAnsi="Consolas" w:cs="Consolas"/>
+                <w:b w:val="0"/>
+                <w:sz w:val="19"/>
+              </w:rPr>
+              <w:t>—</w:t>
+            </w:r>
+          </w:p>
+        </w:tc>
+        <w:tc>
+          <w:tcPr>
+            <w:shd w:fill="ffffff" w:val="clear"/>
+            <w:tcMar>
+              <w:top w:w="80.0" w:type="dxa"/>
+              <w:left w:w="100.0" w:type="dxa"/>
+              <w:bottom w:w="80.0" w:type="dxa"/>
+              <w:right w:w="100.0" w:type="dxa"/>
+            </w:tcMar>
+            <w:vAlign w:val="center"/>
+          </w:tcPr>
+          <w:p>
+            <w:pPr>
+              <w:rPr/>
+            </w:pPr>
+            <w:r>
+              <w:rPr>
+                <w:b w:val="0"/>
+                <w:sz w:val="19"/>
+              </w:rPr>
+              <w:t>Orden lógico del movimiento dentro de una misma transacción (por ejemplo, primero el pago, después el cambio).</w:t>
+            </w:r>
+          </w:p>
+        </w:tc>
+      </w:tr>
+    </w:tbl>
+    <w:p>
+      <w:pPr>
+        <w:spacing w:after="60" w:before="100" w:lineRule="auto"/>
+        <w:rPr/>
+      </w:pPr>
+      <w:r>
+        <w:rPr>
+          <w:b w:val="1"/>
+          <w:bCs w:val="1"/>
+          <w:i w:val="1"/>
+          <w:iCs w:val="1"/>
+          <w:rtl w:val="0"/>
+        </w:rPr>
+        <w:t xml:space="preserve">Notas de diseño:</w:t>
+      </w:r>
+      <w:r>
+        <w:rPr>
+          <w:rtl w:val="0"/>
+        </w:rPr>
+      </w:r>
+    </w:p>
+    <w:p>
+      <w:pPr>
+        <w:keepNext w:val="0"/>
+        <w:keepLines w:val="0"/>
+        <w:pageBreakBefore w:val="0"/>
+        <w:widowControl w:val="1"/>
+        <w:numPr>
+          <w:ilvl w:val="0"/>
+          <w:numId w:val="1"/>
+        </w:numPr>
+        <w:pBdr>
+          <w:top w:space="0" w:sz="0" w:val="nil"/>
+          <w:left w:space="0" w:sz="0" w:val="nil"/>
+          <w:bottom w:space="0" w:sz="0" w:val="nil"/>
+          <w:right w:space="0" w:sz="0" w:val="nil"/>
+          <w:between w:space="0" w:sz="0" w:val="nil"/>
+        </w:pBdr>
+        <w:shd w:fill="auto" w:val="clear"/>
+        <w:spacing w:after="60" w:before="0" w:line="240" w:lineRule="auto"/>
+        <w:ind w:left="360" w:right="0" w:hanging="260"/>
+        <w:jc w:val="left"/>
+        <w:rPr/>
+      </w:pPr>
+      <w:r>
+        <w:t>Esta tabla reemplaza lo que en un borrador previo eran dos tablas separadas (efectivo_insertado y movimientos_efectivo): mantenerlas separadas hubiera duplicado el mismo hecho (qué pieza se usó y en qué transacción) en dos lugares distintos.</w:t>
+      </w:r>
+    </w:p>
+    <w:p>
+      <w:pPr>
+        <w:keepNext w:val="0"/>
+        <w:keepLines w:val="0"/>
+        <w:pageBreakBefore w:val="0"/>
+        <w:widowControl w:val="1"/>
+        <w:numPr>
+          <w:ilvl w:val="0"/>
+          <w:numId w:val="1"/>
+        </w:numPr>
+        <w:pBdr>
+          <w:top w:space="0" w:sz="0" w:val="nil"/>
+          <w:left w:space="0" w:sz="0" w:val="nil"/>
+          <w:bottom w:space="0" w:sz="0" w:val="nil"/>
+          <w:right w:space="0" w:sz="0" w:val="nil"/>
+          <w:between w:space="0" w:sz="0" w:val="nil"/>
+        </w:pBdr>
+        <w:shd w:fill="auto" w:val="clear"/>
+        <w:spacing w:after="60" w:before="0" w:line="240" w:lineRule="auto"/>
+        <w:ind w:left="360" w:right="0" w:hanging="260"/>
+        <w:jc w:val="left"/>
+        <w:rPr/>
+      </w:pPr>
+      <w:r>
+        <w:t>Al cerrar una venta en efectivo, se inserta una fila por cada denominación recibida (PAGO_RECIBIDO) y una por cada denominación devuelta como cambio (CAMBIO_ENTREGADO), y se actualiza caja_efectivo en la misma transacción SQL, igual que guardarReposicion aplica stock, precio y movimiento juntos.</w:t>
+      </w:r>
+    </w:p>
+    <w:p>
+      <w:pPr>
         <w:keepNext w:val="0"/>
         <w:keepLines w:val="0"/>
         <w:pageBreakBefore w:val="0"/>
@@ -13381,7 +15730,7 @@
         <w:rPr>
           <w:rtl w:val="0"/>
         </w:rPr>
-        <w:t xml:space="preserve">Todas las relaciones del esquema son de uno a muchos (1:N); no existe ninguna relación de muchos a muchos. La única relación que se comporta como uno a uno (1:1) en la práctica es transacciones–comandos, forzada mediante una restricción UNIQUE.</w:t>
+        <w:t>Todas las demás relaciones del esquema son de uno a muchos (1:N); no existe ninguna relación de muchos a muchos. Dos relaciones se comportan como uno a uno (1:1) en la práctica: transacciones–comandos, forzada mediante una restricción UNIQUE, y denominaciones–caja_efectivo, forzada porque id_denominacion es a la vez PK y FK.</w:t>
       </w:r>
     </w:p>
     <w:tbl>
@@ -14822,6 +17171,414 @@
               <w:rPr>
                 <w:rtl w:val="0"/>
               </w:rPr>
+            </w:r>
+          </w:p>
+        </w:tc>
+      </w:tr>
+      <w:tr>
+        <w:trPr>
+          <w:cantSplit w:val="0"/>
+          <w:tblHeader w:val="0"/>
+        </w:trPr>
+        <w:tc>
+          <w:tcPr>
+            <w:shd w:fill="f2f2f2" w:val="clear"/>
+            <w:tcMar>
+              <w:top w:w="80.0" w:type="dxa"/>
+              <w:left w:w="100.0" w:type="dxa"/>
+              <w:bottom w:w="80.0" w:type="dxa"/>
+              <w:right w:w="100.0" w:type="dxa"/>
+            </w:tcMar>
+            <w:vAlign w:val="center"/>
+          </w:tcPr>
+          <w:p>
+            <w:pPr>
+              <w:rPr/>
+            </w:pPr>
+            <w:r>
+              <w:rPr>
+                <w:b w:val="0"/>
+                <w:sz w:val="19"/>
+              </w:rPr>
+              <w:t>denominaciones → caja_efectivo</w:t>
+            </w:r>
+          </w:p>
+        </w:tc>
+        <w:tc>
+          <w:tcPr>
+            <w:shd w:fill="f2f2f2" w:val="clear"/>
+            <w:tcMar>
+              <w:top w:w="80.0" w:type="dxa"/>
+              <w:left w:w="100.0" w:type="dxa"/>
+              <w:bottom w:w="80.0" w:type="dxa"/>
+              <w:right w:w="100.0" w:type="dxa"/>
+            </w:tcMar>
+            <w:vAlign w:val="center"/>
+          </w:tcPr>
+          <w:p>
+            <w:pPr>
+              <w:rPr/>
+            </w:pPr>
+            <w:r>
+              <w:rPr>
+                <w:b w:val="0"/>
+                <w:sz w:val="19"/>
+              </w:rPr>
+              <w:t>1 : 1</w:t>
+            </w:r>
+          </w:p>
+        </w:tc>
+        <w:tc>
+          <w:tcPr>
+            <w:shd w:fill="f2f2f2" w:val="clear"/>
+            <w:tcMar>
+              <w:top w:w="80.0" w:type="dxa"/>
+              <w:left w:w="100.0" w:type="dxa"/>
+              <w:bottom w:w="80.0" w:type="dxa"/>
+              <w:right w:w="100.0" w:type="dxa"/>
+            </w:tcMar>
+            <w:vAlign w:val="center"/>
+          </w:tcPr>
+          <w:p>
+            <w:pPr>
+              <w:rPr/>
+            </w:pPr>
+            <w:r>
+              <w:rPr>
+                <w:b w:val="0"/>
+                <w:sz w:val="19"/>
+              </w:rPr>
+              <w:t>Obligatoria</w:t>
+            </w:r>
+          </w:p>
+        </w:tc>
+        <w:tc>
+          <w:tcPr>
+            <w:shd w:fill="f2f2f2" w:val="clear"/>
+            <w:tcMar>
+              <w:top w:w="80.0" w:type="dxa"/>
+              <w:left w:w="100.0" w:type="dxa"/>
+              <w:bottom w:w="80.0" w:type="dxa"/>
+              <w:right w:w="100.0" w:type="dxa"/>
+            </w:tcMar>
+            <w:vAlign w:val="center"/>
+          </w:tcPr>
+          <w:p>
+            <w:pPr>
+              <w:rPr/>
+            </w:pPr>
+            <w:r>
+              <w:rPr>
+                <w:b w:val="0"/>
+                <w:sz w:val="19"/>
+              </w:rPr>
+              <w:t>Cada denominación activa tiene exactamente un registro de cantidad disponible.</w:t>
+            </w:r>
+          </w:p>
+        </w:tc>
+      </w:tr>
+      <w:tr>
+        <w:trPr>
+          <w:cantSplit w:val="0"/>
+          <w:tblHeader w:val="0"/>
+        </w:trPr>
+        <w:tc>
+          <w:tcPr>
+            <w:shd w:fill="f2f2f2" w:val="clear"/>
+            <w:tcMar>
+              <w:top w:w="80.0" w:type="dxa"/>
+              <w:left w:w="100.0" w:type="dxa"/>
+              <w:bottom w:w="80.0" w:type="dxa"/>
+              <w:right w:w="100.0" w:type="dxa"/>
+            </w:tcMar>
+            <w:vAlign w:val="center"/>
+          </w:tcPr>
+          <w:p>
+            <w:pPr>
+              <w:rPr/>
+            </w:pPr>
+            <w:r>
+              <w:rPr>
+                <w:b w:val="0"/>
+                <w:sz w:val="19"/>
+              </w:rPr>
+              <w:t>denominaciones → movimientos_efectivo</w:t>
+            </w:r>
+          </w:p>
+        </w:tc>
+        <w:tc>
+          <w:tcPr>
+            <w:shd w:fill="f2f2f2" w:val="clear"/>
+            <w:tcMar>
+              <w:top w:w="80.0" w:type="dxa"/>
+              <w:left w:w="100.0" w:type="dxa"/>
+              <w:bottom w:w="80.0" w:type="dxa"/>
+              <w:right w:w="100.0" w:type="dxa"/>
+            </w:tcMar>
+            <w:vAlign w:val="center"/>
+          </w:tcPr>
+          <w:p>
+            <w:pPr>
+              <w:rPr/>
+            </w:pPr>
+            <w:r>
+              <w:rPr>
+                <w:b w:val="0"/>
+                <w:sz w:val="19"/>
+              </w:rPr>
+              <w:t>1 : N</w:t>
+            </w:r>
+          </w:p>
+        </w:tc>
+        <w:tc>
+          <w:tcPr>
+            <w:shd w:fill="f2f2f2" w:val="clear"/>
+            <w:tcMar>
+              <w:top w:w="80.0" w:type="dxa"/>
+              <w:left w:w="100.0" w:type="dxa"/>
+              <w:bottom w:w="80.0" w:type="dxa"/>
+              <w:right w:w="100.0" w:type="dxa"/>
+            </w:tcMar>
+            <w:vAlign w:val="center"/>
+          </w:tcPr>
+          <w:p>
+            <w:pPr>
+              <w:rPr/>
+            </w:pPr>
+            <w:r>
+              <w:rPr>
+                <w:b w:val="0"/>
+                <w:sz w:val="19"/>
+              </w:rPr>
+              <w:t>Obligatoria</w:t>
+            </w:r>
+          </w:p>
+        </w:tc>
+        <w:tc>
+          <w:tcPr>
+            <w:shd w:fill="f2f2f2" w:val="clear"/>
+            <w:tcMar>
+              <w:top w:w="80.0" w:type="dxa"/>
+              <w:left w:w="100.0" w:type="dxa"/>
+              <w:bottom w:w="80.0" w:type="dxa"/>
+              <w:right w:w="100.0" w:type="dxa"/>
+            </w:tcMar>
+            <w:vAlign w:val="center"/>
+          </w:tcPr>
+          <w:p>
+            <w:pPr>
+              <w:rPr/>
+            </w:pPr>
+            <w:r>
+              <w:rPr>
+                <w:b w:val="0"/>
+                <w:sz w:val="19"/>
+              </w:rPr>
+              <w:t>Todo movimiento de efectivo pertenece a una denominación específica.</w:t>
+            </w:r>
+          </w:p>
+        </w:tc>
+      </w:tr>
+      <w:tr>
+        <w:trPr>
+          <w:cantSplit w:val="0"/>
+          <w:tblHeader w:val="0"/>
+        </w:trPr>
+        <w:tc>
+          <w:tcPr>
+            <w:shd w:fill="f2f2f2" w:val="clear"/>
+            <w:tcMar>
+              <w:top w:w="80.0" w:type="dxa"/>
+              <w:left w:w="100.0" w:type="dxa"/>
+              <w:bottom w:w="80.0" w:type="dxa"/>
+              <w:right w:w="100.0" w:type="dxa"/>
+            </w:tcMar>
+            <w:vAlign w:val="center"/>
+          </w:tcPr>
+          <w:p>
+            <w:pPr>
+              <w:rPr/>
+            </w:pPr>
+            <w:r>
+              <w:rPr>
+                <w:b w:val="0"/>
+                <w:sz w:val="19"/>
+              </w:rPr>
+              <w:t>transacciones → movimientos_efectivo</w:t>
+            </w:r>
+          </w:p>
+        </w:tc>
+        <w:tc>
+          <w:tcPr>
+            <w:shd w:fill="f2f2f2" w:val="clear"/>
+            <w:tcMar>
+              <w:top w:w="80.0" w:type="dxa"/>
+              <w:left w:w="100.0" w:type="dxa"/>
+              <w:bottom w:w="80.0" w:type="dxa"/>
+              <w:right w:w="100.0" w:type="dxa"/>
+            </w:tcMar>
+            <w:vAlign w:val="center"/>
+          </w:tcPr>
+          <w:p>
+            <w:pPr>
+              <w:rPr/>
+            </w:pPr>
+            <w:r>
+              <w:rPr>
+                <w:b w:val="0"/>
+                <w:sz w:val="19"/>
+              </w:rPr>
+              <w:t>1 : N</w:t>
+            </w:r>
+          </w:p>
+        </w:tc>
+        <w:tc>
+          <w:tcPr>
+            <w:shd w:fill="f2f2f2" w:val="clear"/>
+            <w:tcMar>
+              <w:top w:w="80.0" w:type="dxa"/>
+              <w:left w:w="100.0" w:type="dxa"/>
+              <w:bottom w:w="80.0" w:type="dxa"/>
+              <w:right w:w="100.0" w:type="dxa"/>
+            </w:tcMar>
+            <w:vAlign w:val="center"/>
+          </w:tcPr>
+          <w:p>
+            <w:pPr>
+              <w:rPr/>
+            </w:pPr>
+            <w:r>
+              <w:rPr>
+                <w:b w:val="0"/>
+                <w:sz w:val="19"/>
+              </w:rPr>
+              <w:t>Opcional</w:t>
+            </w:r>
+          </w:p>
+        </w:tc>
+        <w:tc>
+          <w:tcPr>
+            <w:shd w:fill="f2f2f2" w:val="clear"/>
+            <w:tcMar>
+              <w:top w:w="80.0" w:type="dxa"/>
+              <w:left w:w="100.0" w:type="dxa"/>
+              <w:bottom w:w="80.0" w:type="dxa"/>
+              <w:right w:w="100.0" w:type="dxa"/>
+            </w:tcMar>
+            <w:vAlign w:val="center"/>
+          </w:tcPr>
+          <w:p>
+            <w:pPr>
+              <w:rPr/>
+            </w:pPr>
+            <w:r>
+              <w:rPr>
+                <w:b w:val="0"/>
+                <w:sz w:val="19"/>
+              </w:rPr>
+              <w:t>Solo las ventas pagadas en efectivo generan movimientos; los ajustes manuales no tienen transacción asociada.</w:t>
+            </w:r>
+          </w:p>
+        </w:tc>
+      </w:tr>
+      <w:tr>
+        <w:trPr>
+          <w:cantSplit w:val="0"/>
+          <w:tblHeader w:val="0"/>
+        </w:trPr>
+        <w:tc>
+          <w:tcPr>
+            <w:shd w:fill="f2f2f2" w:val="clear"/>
+            <w:tcMar>
+              <w:top w:w="80.0" w:type="dxa"/>
+              <w:left w:w="100.0" w:type="dxa"/>
+              <w:bottom w:w="80.0" w:type="dxa"/>
+              <w:right w:w="100.0" w:type="dxa"/>
+            </w:tcMar>
+            <w:vAlign w:val="center"/>
+          </w:tcPr>
+          <w:p>
+            <w:pPr>
+              <w:rPr/>
+            </w:pPr>
+            <w:r>
+              <w:rPr>
+                <w:b w:val="0"/>
+                <w:sz w:val="19"/>
+              </w:rPr>
+              <w:t>administradores → movimientos_efectivo</w:t>
+            </w:r>
+          </w:p>
+        </w:tc>
+        <w:tc>
+          <w:tcPr>
+            <w:shd w:fill="f2f2f2" w:val="clear"/>
+            <w:tcMar>
+              <w:top w:w="80.0" w:type="dxa"/>
+              <w:left w:w="100.0" w:type="dxa"/>
+              <w:bottom w:w="80.0" w:type="dxa"/>
+              <w:right w:w="100.0" w:type="dxa"/>
+            </w:tcMar>
+            <w:vAlign w:val="center"/>
+          </w:tcPr>
+          <w:p>
+            <w:pPr>
+              <w:rPr/>
+            </w:pPr>
+            <w:r>
+              <w:rPr>
+                <w:b w:val="0"/>
+                <w:sz w:val="19"/>
+              </w:rPr>
+              <w:t>1 : N</w:t>
+            </w:r>
+          </w:p>
+        </w:tc>
+        <w:tc>
+          <w:tcPr>
+            <w:shd w:fill="f2f2f2" w:val="clear"/>
+            <w:tcMar>
+              <w:top w:w="80.0" w:type="dxa"/>
+              <w:left w:w="100.0" w:type="dxa"/>
+              <w:bottom w:w="80.0" w:type="dxa"/>
+              <w:right w:w="100.0" w:type="dxa"/>
+            </w:tcMar>
+            <w:vAlign w:val="center"/>
+          </w:tcPr>
+          <w:p>
+            <w:pPr>
+              <w:rPr/>
+            </w:pPr>
+            <w:r>
+              <w:rPr>
+                <w:b w:val="0"/>
+                <w:sz w:val="19"/>
+              </w:rPr>
+              <w:t>Opcional</w:t>
+            </w:r>
+          </w:p>
+        </w:tc>
+        <w:tc>
+          <w:tcPr>
+            <w:shd w:fill="f2f2f2" w:val="clear"/>
+            <w:tcMar>
+              <w:top w:w="80.0" w:type="dxa"/>
+              <w:left w:w="100.0" w:type="dxa"/>
+              <w:bottom w:w="80.0" w:type="dxa"/>
+              <w:right w:w="100.0" w:type="dxa"/>
+            </w:tcMar>
+            <w:vAlign w:val="center"/>
+          </w:tcPr>
+          <w:p>
+            <w:pPr>
+              <w:rPr/>
+            </w:pPr>
+            <w:r>
+              <w:rPr>
+                <w:b w:val="0"/>
+                <w:sz w:val="19"/>
+              </w:rPr>
+              <w:t>El movimiento puede ser automático (parte de una venta), sin operador humano.</w:t>
             </w:r>
           </w:p>
         </w:tc>
@@ -14997,6 +17754,33 @@
     </w:p>
     <w:p>
       <w:pPr>
+        <w:keepNext w:val="0"/>
+        <w:keepLines w:val="0"/>
+        <w:pageBreakBefore w:val="0"/>
+        <w:widowControl w:val="1"/>
+        <w:numPr>
+          <w:ilvl w:val="0"/>
+          <w:numId w:val="1"/>
+        </w:numPr>
+        <w:pBdr>
+          <w:top w:space="0" w:sz="0" w:val="nil"/>
+          <w:left w:space="0" w:sz="0" w:val="nil"/>
+          <w:bottom w:space="0" w:sz="0" w:val="nil"/>
+          <w:right w:space="0" w:sz="0" w:val="nil"/>
+          <w:between w:space="0" w:sz="0" w:val="nil"/>
+        </w:pBdr>
+        <w:shd w:fill="auto" w:val="clear"/>
+        <w:spacing w:after="60" w:before="0" w:line="240" w:lineRule="auto"/>
+        <w:ind w:left="360" w:right="0" w:hanging="260"/>
+        <w:jc w:val="left"/>
+        <w:rPr/>
+      </w:pPr>
+      <w:r>
+        <w:t>Se agregaron las tablas denominaciones, caja_efectivo y movimientos_efectivo para soportar el pago simulado en efectivo por teclado (sin aceptador físico de monedas) y su cambio: composición del pago, cantidad disponible para dar cambio, y ajustes manuales desde la web.</w:t>
+      </w:r>
+    </w:p>
+    <w:p>
+      <w:pPr>
         <w:pStyle w:val="Heading1"/>
         <w:spacing w:after="150" w:before="300" w:lineRule="auto"/>
         <w:rPr/>
@@ -15243,6 +18027,84 @@
               <w:rPr>
                 <w:rtl w:val="0"/>
               </w:rPr>
+            </w:r>
+          </w:p>
+        </w:tc>
+      </w:tr>
+      <w:tr>
+        <w:trPr>
+          <w:cantSplit w:val="0"/>
+          <w:tblHeader w:val="0"/>
+        </w:trPr>
+        <w:tc>
+          <w:tcPr>
+            <w:shd w:fill="ffffff" w:val="clear"/>
+            <w:tcMar>
+              <w:top w:w="80.0" w:type="dxa"/>
+              <w:left w:w="100.0" w:type="dxa"/>
+              <w:bottom w:w="80.0" w:type="dxa"/>
+              <w:right w:w="100.0" w:type="dxa"/>
+            </w:tcMar>
+            <w:vAlign w:val="center"/>
+          </w:tcPr>
+          <w:p>
+            <w:pPr>
+              <w:rPr/>
+            </w:pPr>
+            <w:r>
+              <w:rPr>
+                <w:b w:val="0"/>
+                <w:sz w:val="19"/>
+              </w:rPr>
+              <w:t>2</w:t>
+            </w:r>
+          </w:p>
+        </w:tc>
+        <w:tc>
+          <w:tcPr>
+            <w:shd w:fill="ffffff" w:val="clear"/>
+            <w:tcMar>
+              <w:top w:w="80.0" w:type="dxa"/>
+              <w:left w:w="100.0" w:type="dxa"/>
+              <w:bottom w:w="80.0" w:type="dxa"/>
+              <w:right w:w="100.0" w:type="dxa"/>
+            </w:tcMar>
+            <w:vAlign w:val="center"/>
+          </w:tcPr>
+          <w:p>
+            <w:pPr>
+              <w:rPr/>
+            </w:pPr>
+            <w:r>
+              <w:rPr>
+                <w:b w:val="0"/>
+                <w:sz w:val="19"/>
+              </w:rPr>
+              <w:t>Hito D3–D5</w:t>
+            </w:r>
+          </w:p>
+        </w:tc>
+        <w:tc>
+          <w:tcPr>
+            <w:shd w:fill="ffffff" w:val="clear"/>
+            <w:tcMar>
+              <w:top w:w="80.0" w:type="dxa"/>
+              <w:left w:w="100.0" w:type="dxa"/>
+              <w:bottom w:w="80.0" w:type="dxa"/>
+              <w:right w:w="100.0" w:type="dxa"/>
+            </w:tcMar>
+            <w:vAlign w:val="center"/>
+          </w:tcPr>
+          <w:p>
+            <w:pPr>
+              <w:rPr/>
+            </w:pPr>
+            <w:r>
+              <w:rPr>
+                <w:b w:val="0"/>
+                <w:sz w:val="19"/>
+              </w:rPr>
+              <w:t>Se agregó soporte de pago simulado en efectivo: tablas denominaciones, caja_efectivo y movimientos_efectivo (14 tablas en total). schema.sql y seed.sql actualizados.</w:t>
             </w:r>
           </w:p>
         </w:tc>

</xml_diff>